<commit_message>
feat: tartalom jegyzék, ötletek, felhasznált technológiák fejezet
</commit_message>
<xml_diff>
--- a/Sazkdolgozat.docx
+++ b/Sazkdolgozat.docx
@@ -19,10 +19,7 @@
         <w:pStyle w:val="dek1"/>
       </w:pPr>
       <w:r>
-        <w:t xml:space="preserve">Informatikai </w:t>
-      </w:r>
-      <w:r>
-        <w:t>Intézet</w:t>
+        <w:t>Informatikai Intézet</w:t>
       </w:r>
     </w:p>
     <w:p/>
@@ -93,19 +90,7 @@
         <w:rPr>
           <w:lang w:val="hu-HU"/>
         </w:rPr>
-        <w:t>20</w:t>
-      </w:r>
-      <w:r>
-        <w:rPr>
-          <w:lang w:val="hu-HU"/>
-        </w:rPr>
-        <w:t>2</w:t>
-      </w:r>
-      <w:r>
-        <w:rPr>
-          <w:lang w:val="hu-HU"/>
-        </w:rPr>
-        <w:t>6</w:t>
+        <w:t>2026</w:t>
       </w:r>
     </w:p>
     <w:p/>
@@ -152,13 +137,7 @@
         <w:rPr>
           <w:lang w:val="hu-HU"/>
         </w:rPr>
-        <w:t xml:space="preserve">Informatikai </w:t>
-      </w:r>
-      <w:r>
-        <w:rPr>
-          <w:lang w:val="hu-HU"/>
-        </w:rPr>
-        <w:t>Intézet</w:t>
+        <w:t>Informatikai Intézet</w:t>
       </w:r>
     </w:p>
     <w:p/>
@@ -500,6 +479,8 @@
     <w:p/>
     <w:p>
       <w:pPr>
+        <w:spacing w:before="280" w:after="280"/>
+        <w:jc w:val="center"/>
         <w:rPr>
           <w:rFonts w:ascii="Times New Roman" w:hAnsi="Times New Roman" w:cs="Times New Roman"/>
           <w:b/>
@@ -528,93 +509,2928 @@
     </w:p>
     <w:p>
       <w:pPr>
-        <w:rPr>
-          <w:rFonts w:ascii="Arial" w:hAnsi="Arial" w:cs="Arial"/>
+        <w:pStyle w:val="szmozatlanSzakdolgozath1"/>
+      </w:pPr>
+      <w:bookmarkStart w:id="0" w:name="_Toc225005154"/>
+      <w:r>
+        <w:lastRenderedPageBreak/>
+        <w:t>Feladatkiírás</w:t>
+      </w:r>
+      <w:bookmarkEnd w:id="0"/>
+    </w:p>
+    <w:p>
+      <w:pPr>
+        <w:spacing w:line="360" w:lineRule="auto"/>
+        <w:ind w:firstLine="720"/>
+        <w:jc w:val="both"/>
+        <w:rPr>
+          <w:rFonts w:ascii="Times New Roman" w:hAnsi="Times New Roman" w:cs="Times New Roman"/>
+          <w:sz w:val="24"/>
+          <w:szCs w:val="24"/>
+        </w:rPr>
+      </w:pPr>
+      <w:r>
+        <w:rPr>
+          <w:rFonts w:ascii="Times New Roman" w:hAnsi="Times New Roman" w:cs="Times New Roman"/>
+          <w:sz w:val="24"/>
+          <w:szCs w:val="24"/>
+        </w:rPr>
+        <w:t>A feladatom egy webes keretbe foglalt szabaduló szoba játék megvalósítása volt, amelyben a pályák felépítését és a játék során megjelenő elemek tartalmát mesterséges intelligencia generálja. Az alkalmazás célja egy olyan rugalmas és bővíthető rendszer létrehozása, amely képes minden játékos számára egyedi élményt biztosítani.</w:t>
+      </w:r>
+    </w:p>
+    <w:p>
+      <w:pPr>
+        <w:spacing w:line="360" w:lineRule="auto"/>
+        <w:ind w:firstLine="720"/>
+        <w:jc w:val="both"/>
+        <w:rPr>
+          <w:rFonts w:ascii="Times New Roman" w:hAnsi="Times New Roman" w:cs="Times New Roman"/>
+          <w:sz w:val="24"/>
+          <w:szCs w:val="24"/>
+        </w:rPr>
+      </w:pPr>
+      <w:r>
+        <w:rPr>
+          <w:rFonts w:ascii="Times New Roman" w:hAnsi="Times New Roman" w:cs="Times New Roman"/>
+          <w:sz w:val="24"/>
+          <w:szCs w:val="24"/>
+        </w:rPr>
+        <w:t>A játék alapját generikus játékelemek alkotják, amelyek konkrét tartalommal való feltöltését a mesterséges intelligencia végzi. Ennek köszönhetően minden egyes generált pálya eltérő felépítésű és történetű lehet, így a játék újrajátszhatósága jelentősen növekszik. A pályákhoz tartozó logikai feladatok egymásra épülnek, ezért a játékosoknak azokat meghatározott sorrendben kell megoldaniuk a tovább</w:t>
+      </w:r>
+      <w:r>
+        <w:rPr>
+          <w:rFonts w:ascii="Times New Roman" w:hAnsi="Times New Roman" w:cs="Times New Roman"/>
+          <w:sz w:val="24"/>
+          <w:szCs w:val="24"/>
+        </w:rPr>
+        <w:t xml:space="preserve"> </w:t>
+      </w:r>
+      <w:r>
+        <w:rPr>
+          <w:rFonts w:ascii="Times New Roman" w:hAnsi="Times New Roman" w:cs="Times New Roman"/>
+          <w:sz w:val="24"/>
+          <w:szCs w:val="24"/>
+        </w:rPr>
+        <w:t>haladás érdekében.</w:t>
+      </w:r>
+    </w:p>
+    <w:p>
+      <w:pPr>
+        <w:spacing w:line="360" w:lineRule="auto"/>
+        <w:ind w:firstLine="720"/>
+        <w:jc w:val="both"/>
+        <w:rPr>
+          <w:rFonts w:ascii="Times New Roman" w:hAnsi="Times New Roman" w:cs="Times New Roman"/>
+          <w:sz w:val="24"/>
+          <w:szCs w:val="24"/>
+        </w:rPr>
+      </w:pPr>
+      <w:r>
+        <w:rPr>
+          <w:rFonts w:ascii="Times New Roman" w:hAnsi="Times New Roman" w:cs="Times New Roman"/>
+          <w:sz w:val="24"/>
+          <w:szCs w:val="24"/>
+        </w:rPr>
+        <w:t>A pályák struktúráját, a hozzájuk tartozó történetet, valamint a grafikai elemeket – például tárgyakat, környezetet vagy interaktív objektumokat – szintén a mesterséges intelligencia generálja, figyelembe véve az adott pálya tematikáját. Ez lehetővé teszi, hogy a vizuális megjelenés és a játékmenet egységes és konzisztens élményt nyújtson.</w:t>
+      </w:r>
+    </w:p>
+    <w:p>
+      <w:pPr>
+        <w:spacing w:line="360" w:lineRule="auto"/>
+        <w:ind w:firstLine="720"/>
+        <w:jc w:val="both"/>
+        <w:rPr>
+          <w:rFonts w:ascii="Times New Roman" w:hAnsi="Times New Roman" w:cs="Times New Roman"/>
+          <w:sz w:val="24"/>
+          <w:szCs w:val="24"/>
+        </w:rPr>
+      </w:pPr>
+      <w:r>
+        <w:rPr>
+          <w:rFonts w:ascii="Times New Roman" w:hAnsi="Times New Roman" w:cs="Times New Roman"/>
+          <w:sz w:val="24"/>
+          <w:szCs w:val="24"/>
+        </w:rPr>
+        <w:t xml:space="preserve">Az alkalmazás nem csupán maga a játék, hanem egy teljes webes rendszerként működik. Lehetőséget biztosít felhasználói fiókok kezelésére, ahol a felhasználók saját pályákat generálhatnak. A pályagenerálás </w:t>
+      </w:r>
+      <w:proofErr w:type="spellStart"/>
+      <w:r>
+        <w:rPr>
+          <w:rFonts w:ascii="Times New Roman" w:hAnsi="Times New Roman" w:cs="Times New Roman"/>
+          <w:sz w:val="24"/>
+          <w:szCs w:val="24"/>
+        </w:rPr>
+        <w:t>token</w:t>
+      </w:r>
+      <w:proofErr w:type="spellEnd"/>
+      <w:r>
+        <w:rPr>
+          <w:rFonts w:ascii="Times New Roman" w:hAnsi="Times New Roman" w:cs="Times New Roman"/>
+          <w:sz w:val="24"/>
+          <w:szCs w:val="24"/>
+        </w:rPr>
+        <w:t xml:space="preserve"> alapú rendszerhez kötött, ahol a felhasználók </w:t>
+      </w:r>
+      <w:proofErr w:type="spellStart"/>
+      <w:r>
+        <w:rPr>
+          <w:rFonts w:ascii="Times New Roman" w:hAnsi="Times New Roman" w:cs="Times New Roman"/>
+          <w:sz w:val="24"/>
+          <w:szCs w:val="24"/>
+        </w:rPr>
+        <w:t>tokeneket</w:t>
+      </w:r>
+      <w:proofErr w:type="spellEnd"/>
+      <w:r>
+        <w:rPr>
+          <w:rFonts w:ascii="Times New Roman" w:hAnsi="Times New Roman" w:cs="Times New Roman"/>
+          <w:sz w:val="24"/>
+          <w:szCs w:val="24"/>
+        </w:rPr>
+        <w:t xml:space="preserve"> vásárolhatnak, és ezek felhasználásával indíthatják el az új pályák létrehozását.</w:t>
+      </w:r>
+    </w:p>
+    <w:p>
+      <w:pPr>
+        <w:spacing w:line="360" w:lineRule="auto"/>
+        <w:ind w:firstLine="720"/>
+        <w:jc w:val="both"/>
+        <w:rPr>
+          <w:rFonts w:ascii="Times New Roman" w:hAnsi="Times New Roman" w:cs="Times New Roman"/>
+          <w:sz w:val="24"/>
+          <w:szCs w:val="24"/>
+        </w:rPr>
+      </w:pPr>
+      <w:r>
+        <w:rPr>
+          <w:rFonts w:ascii="Times New Roman" w:hAnsi="Times New Roman" w:cs="Times New Roman"/>
+          <w:sz w:val="24"/>
+          <w:szCs w:val="24"/>
+        </w:rPr>
+        <w:t>A rendszer támogatja a generált pályák közötti böngészést és keresést, így a felhasználók mások által létrehozott tartalmakat is kipróbálhatnak. Emellett lehetőség van a pályák értékelésére és kedvencekhez adására, amely közösségi funkciókkal egészíti ki az alkalmazást.</w:t>
+      </w:r>
+    </w:p>
+    <w:p>
+      <w:pPr>
+        <w:spacing w:line="360" w:lineRule="auto"/>
+        <w:ind w:firstLine="720"/>
+        <w:jc w:val="both"/>
+        <w:rPr>
+          <w:rFonts w:ascii="Times New Roman" w:hAnsi="Times New Roman" w:cs="Times New Roman"/>
+          <w:sz w:val="24"/>
+          <w:szCs w:val="24"/>
+        </w:rPr>
+      </w:pPr>
+      <w:r>
+        <w:rPr>
+          <w:rFonts w:ascii="Times New Roman" w:hAnsi="Times New Roman" w:cs="Times New Roman"/>
+          <w:sz w:val="24"/>
+          <w:szCs w:val="24"/>
+        </w:rPr>
+        <w:t xml:space="preserve">A pályagenerálási folyamatokhoz részletes statisztikai adatgyűjtés is kapcsolódik. A rendszer rögzíti többek között a generáláshoz, </w:t>
+      </w:r>
+      <w:proofErr w:type="spellStart"/>
+      <w:r>
+        <w:rPr>
+          <w:rFonts w:ascii="Times New Roman" w:hAnsi="Times New Roman" w:cs="Times New Roman"/>
+          <w:sz w:val="24"/>
+          <w:szCs w:val="24"/>
+        </w:rPr>
+        <w:t>validáláshoz</w:t>
+      </w:r>
+      <w:proofErr w:type="spellEnd"/>
+      <w:r>
+        <w:rPr>
+          <w:rFonts w:ascii="Times New Roman" w:hAnsi="Times New Roman" w:cs="Times New Roman"/>
+          <w:sz w:val="24"/>
+          <w:szCs w:val="24"/>
+        </w:rPr>
+        <w:t xml:space="preserve"> és esetleges javításokhoz felhasznált </w:t>
+      </w:r>
+      <w:proofErr w:type="spellStart"/>
+      <w:r>
+        <w:rPr>
+          <w:rFonts w:ascii="Times New Roman" w:hAnsi="Times New Roman" w:cs="Times New Roman"/>
+          <w:sz w:val="24"/>
+          <w:szCs w:val="24"/>
+        </w:rPr>
+        <w:t>tokenek</w:t>
+      </w:r>
+      <w:proofErr w:type="spellEnd"/>
+      <w:r>
+        <w:rPr>
+          <w:rFonts w:ascii="Times New Roman" w:hAnsi="Times New Roman" w:cs="Times New Roman"/>
+          <w:sz w:val="24"/>
+          <w:szCs w:val="24"/>
+        </w:rPr>
+        <w:t xml:space="preserve"> mennyiségét, valamint az egyes folyamatok időigényét. Ezek az adatok lehetőséget biztosítanak a rendszer működésének elemzésére és optimalizálására.</w:t>
+      </w:r>
+    </w:p>
+    <w:p>
+      <w:pPr>
+        <w:rPr>
+          <w:rFonts w:ascii="Times New Roman" w:hAnsi="Times New Roman" w:cs="Times New Roman"/>
+          <w:sz w:val="24"/>
+          <w:szCs w:val="24"/>
+        </w:rPr>
+      </w:pPr>
+      <w:r>
+        <w:rPr>
+          <w:rFonts w:ascii="Times New Roman" w:hAnsi="Times New Roman" w:cs="Times New Roman"/>
+          <w:sz w:val="24"/>
+          <w:szCs w:val="24"/>
+        </w:rPr>
+        <w:br w:type="page"/>
+      </w:r>
+    </w:p>
+    <w:p>
+      <w:pPr>
+        <w:pStyle w:val="szmozatlanSzakdolgozath1"/>
+      </w:pPr>
+      <w:bookmarkStart w:id="1" w:name="_Toc225005155"/>
+      <w:r>
+        <w:lastRenderedPageBreak/>
+        <w:t>Tartalomjegyzék</w:t>
+      </w:r>
+      <w:bookmarkEnd w:id="1"/>
+    </w:p>
+    <w:sdt>
+      <w:sdtPr>
+        <w:id w:val="1358159470"/>
+        <w:docPartObj>
+          <w:docPartGallery w:val="Table of Contents"/>
+          <w:docPartUnique/>
+        </w:docPartObj>
+      </w:sdtPr>
+      <w:sdtEndPr>
+        <w:rPr>
+          <w:rFonts w:asciiTheme="minorHAnsi" w:eastAsiaTheme="minorHAnsi" w:hAnsiTheme="minorHAnsi" w:cstheme="minorBidi"/>
           <w:b/>
           <w:bCs/>
+          <w:noProof/>
+          <w:color w:val="auto"/>
+          <w:kern w:val="2"/>
+          <w:sz w:val="22"/>
+          <w:szCs w:val="22"/>
+          <w:lang w:val="hu-HU"/>
+          <w14:ligatures w14:val="standardContextual"/>
+        </w:rPr>
+      </w:sdtEndPr>
+      <w:sdtContent>
+        <w:p>
+          <w:pPr>
+            <w:pStyle w:val="TOCHeading"/>
+          </w:pPr>
+          <w:r>
+            <w:t xml:space="preserve"> </w:t>
+          </w:r>
+        </w:p>
+        <w:p>
+          <w:pPr>
+            <w:pStyle w:val="TOC1"/>
+            <w:tabs>
+              <w:tab w:val="right" w:leader="dot" w:pos="8827"/>
+            </w:tabs>
+            <w:rPr>
+              <w:rFonts w:eastAsiaTheme="minorEastAsia"/>
+              <w:noProof/>
+              <w:sz w:val="24"/>
+              <w:szCs w:val="24"/>
+              <w:lang w:val="en-US"/>
+            </w:rPr>
+          </w:pPr>
+          <w:r>
+            <w:fldChar w:fldCharType="begin"/>
+          </w:r>
+          <w:r>
+            <w:instrText xml:space="preserve"> TOC \o "1-3" \h \z \u </w:instrText>
+          </w:r>
+          <w:r>
+            <w:fldChar w:fldCharType="separate"/>
+          </w:r>
+          <w:hyperlink w:anchor="_Toc225005154" w:history="1">
+            <w:r>
+              <w:rPr>
+                <w:rStyle w:val="Hyperlink"/>
+                <w:noProof/>
+              </w:rPr>
+              <w:t>Feladatkiírás</w:t>
+            </w:r>
+            <w:r>
+              <w:rPr>
+                <w:noProof/>
+                <w:webHidden/>
+              </w:rPr>
+              <w:tab/>
+            </w:r>
+            <w:r>
+              <w:rPr>
+                <w:noProof/>
+                <w:webHidden/>
+              </w:rPr>
+              <w:fldChar w:fldCharType="begin"/>
+            </w:r>
+            <w:r>
+              <w:rPr>
+                <w:noProof/>
+                <w:webHidden/>
+              </w:rPr>
+              <w:instrText xml:space="preserve"> PAGEREF _Toc225005154 \h </w:instrText>
+            </w:r>
+            <w:r>
+              <w:rPr>
+                <w:noProof/>
+                <w:webHidden/>
+              </w:rPr>
+            </w:r>
+            <w:r>
+              <w:rPr>
+                <w:noProof/>
+                <w:webHidden/>
+              </w:rPr>
+              <w:fldChar w:fldCharType="separate"/>
+            </w:r>
+            <w:r>
+              <w:rPr>
+                <w:noProof/>
+                <w:webHidden/>
+              </w:rPr>
+              <w:t>2</w:t>
+            </w:r>
+            <w:r>
+              <w:rPr>
+                <w:noProof/>
+                <w:webHidden/>
+              </w:rPr>
+              <w:fldChar w:fldCharType="end"/>
+            </w:r>
+          </w:hyperlink>
+        </w:p>
+        <w:p>
+          <w:pPr>
+            <w:pStyle w:val="TOC1"/>
+            <w:tabs>
+              <w:tab w:val="right" w:leader="dot" w:pos="8827"/>
+            </w:tabs>
+            <w:rPr>
+              <w:rFonts w:eastAsiaTheme="minorEastAsia"/>
+              <w:noProof/>
+              <w:sz w:val="24"/>
+              <w:szCs w:val="24"/>
+              <w:lang w:val="en-US"/>
+            </w:rPr>
+          </w:pPr>
+          <w:hyperlink w:anchor="_Toc225005155" w:history="1">
+            <w:r>
+              <w:rPr>
+                <w:rStyle w:val="Hyperlink"/>
+                <w:noProof/>
+              </w:rPr>
+              <w:t>Tartalomjegyzék</w:t>
+            </w:r>
+            <w:r>
+              <w:rPr>
+                <w:noProof/>
+                <w:webHidden/>
+              </w:rPr>
+              <w:tab/>
+            </w:r>
+            <w:r>
+              <w:rPr>
+                <w:noProof/>
+                <w:webHidden/>
+              </w:rPr>
+              <w:fldChar w:fldCharType="begin"/>
+            </w:r>
+            <w:r>
+              <w:rPr>
+                <w:noProof/>
+                <w:webHidden/>
+              </w:rPr>
+              <w:instrText xml:space="preserve"> PAGEREF _Toc225005155 \h </w:instrText>
+            </w:r>
+            <w:r>
+              <w:rPr>
+                <w:noProof/>
+                <w:webHidden/>
+              </w:rPr>
+            </w:r>
+            <w:r>
+              <w:rPr>
+                <w:noProof/>
+                <w:webHidden/>
+              </w:rPr>
+              <w:fldChar w:fldCharType="separate"/>
+            </w:r>
+            <w:r>
+              <w:rPr>
+                <w:noProof/>
+                <w:webHidden/>
+              </w:rPr>
+              <w:t>3</w:t>
+            </w:r>
+            <w:r>
+              <w:rPr>
+                <w:noProof/>
+                <w:webHidden/>
+              </w:rPr>
+              <w:fldChar w:fldCharType="end"/>
+            </w:r>
+          </w:hyperlink>
+        </w:p>
+        <w:p>
+          <w:pPr>
+            <w:pStyle w:val="TOC1"/>
+            <w:tabs>
+              <w:tab w:val="left" w:pos="440"/>
+              <w:tab w:val="right" w:leader="dot" w:pos="8827"/>
+            </w:tabs>
+            <w:rPr>
+              <w:rFonts w:eastAsiaTheme="minorEastAsia"/>
+              <w:noProof/>
+              <w:sz w:val="24"/>
+              <w:szCs w:val="24"/>
+              <w:lang w:val="en-US"/>
+            </w:rPr>
+          </w:pPr>
+          <w:hyperlink w:anchor="_Toc225005156" w:history="1">
+            <w:r>
+              <w:rPr>
+                <w:rStyle w:val="Hyperlink"/>
+                <w:i/>
+                <w:noProof/>
+              </w:rPr>
+              <w:t>1.</w:t>
+            </w:r>
+            <w:r>
+              <w:rPr>
+                <w:rFonts w:eastAsiaTheme="minorEastAsia"/>
+                <w:noProof/>
+                <w:sz w:val="24"/>
+                <w:szCs w:val="24"/>
+                <w:lang w:val="en-US"/>
+              </w:rPr>
+              <w:tab/>
+            </w:r>
+            <w:r>
+              <w:rPr>
+                <w:rStyle w:val="Hyperlink"/>
+                <w:noProof/>
+              </w:rPr>
+              <w:t>Technológiák</w:t>
+            </w:r>
+            <w:r>
+              <w:rPr>
+                <w:noProof/>
+                <w:webHidden/>
+              </w:rPr>
+              <w:tab/>
+            </w:r>
+            <w:r>
+              <w:rPr>
+                <w:noProof/>
+                <w:webHidden/>
+              </w:rPr>
+              <w:fldChar w:fldCharType="begin"/>
+            </w:r>
+            <w:r>
+              <w:rPr>
+                <w:noProof/>
+                <w:webHidden/>
+              </w:rPr>
+              <w:instrText xml:space="preserve"> PAGEREF _Toc225005156 \h </w:instrText>
+            </w:r>
+            <w:r>
+              <w:rPr>
+                <w:noProof/>
+                <w:webHidden/>
+              </w:rPr>
+            </w:r>
+            <w:r>
+              <w:rPr>
+                <w:noProof/>
+                <w:webHidden/>
+              </w:rPr>
+              <w:fldChar w:fldCharType="separate"/>
+            </w:r>
+            <w:r>
+              <w:rPr>
+                <w:noProof/>
+                <w:webHidden/>
+              </w:rPr>
+              <w:t>5</w:t>
+            </w:r>
+            <w:r>
+              <w:rPr>
+                <w:noProof/>
+                <w:webHidden/>
+              </w:rPr>
+              <w:fldChar w:fldCharType="end"/>
+            </w:r>
+          </w:hyperlink>
+        </w:p>
+        <w:p>
+          <w:pPr>
+            <w:pStyle w:val="TOC2"/>
+            <w:tabs>
+              <w:tab w:val="left" w:pos="960"/>
+              <w:tab w:val="right" w:leader="dot" w:pos="8827"/>
+            </w:tabs>
+            <w:rPr>
+              <w:rFonts w:eastAsiaTheme="minorEastAsia"/>
+              <w:noProof/>
+              <w:sz w:val="24"/>
+              <w:szCs w:val="24"/>
+              <w:lang w:val="en-US"/>
+            </w:rPr>
+          </w:pPr>
+          <w:hyperlink w:anchor="_Toc225005157" w:history="1">
+            <w:r>
+              <w:rPr>
+                <w:rStyle w:val="Hyperlink"/>
+                <w:noProof/>
+              </w:rPr>
+              <w:t>1.1.</w:t>
+            </w:r>
+            <w:r>
+              <w:rPr>
+                <w:rFonts w:eastAsiaTheme="minorEastAsia"/>
+                <w:noProof/>
+                <w:sz w:val="24"/>
+                <w:szCs w:val="24"/>
+                <w:lang w:val="en-US"/>
+              </w:rPr>
+              <w:tab/>
+            </w:r>
+            <w:r>
+              <w:rPr>
+                <w:rStyle w:val="Hyperlink"/>
+                <w:noProof/>
+              </w:rPr>
+              <w:t>Docker és konténerizáció</w:t>
+            </w:r>
+            <w:r>
+              <w:rPr>
+                <w:noProof/>
+                <w:webHidden/>
+              </w:rPr>
+              <w:tab/>
+            </w:r>
+            <w:r>
+              <w:rPr>
+                <w:noProof/>
+                <w:webHidden/>
+              </w:rPr>
+              <w:fldChar w:fldCharType="begin"/>
+            </w:r>
+            <w:r>
+              <w:rPr>
+                <w:noProof/>
+                <w:webHidden/>
+              </w:rPr>
+              <w:instrText xml:space="preserve"> PAGEREF _Toc225005157 \h </w:instrText>
+            </w:r>
+            <w:r>
+              <w:rPr>
+                <w:noProof/>
+                <w:webHidden/>
+              </w:rPr>
+            </w:r>
+            <w:r>
+              <w:rPr>
+                <w:noProof/>
+                <w:webHidden/>
+              </w:rPr>
+              <w:fldChar w:fldCharType="separate"/>
+            </w:r>
+            <w:r>
+              <w:rPr>
+                <w:noProof/>
+                <w:webHidden/>
+              </w:rPr>
+              <w:t>5</w:t>
+            </w:r>
+            <w:r>
+              <w:rPr>
+                <w:noProof/>
+                <w:webHidden/>
+              </w:rPr>
+              <w:fldChar w:fldCharType="end"/>
+            </w:r>
+          </w:hyperlink>
+        </w:p>
+        <w:p>
+          <w:pPr>
+            <w:pStyle w:val="TOC2"/>
+            <w:tabs>
+              <w:tab w:val="left" w:pos="960"/>
+              <w:tab w:val="right" w:leader="dot" w:pos="8827"/>
+            </w:tabs>
+            <w:rPr>
+              <w:rFonts w:eastAsiaTheme="minorEastAsia"/>
+              <w:noProof/>
+              <w:sz w:val="24"/>
+              <w:szCs w:val="24"/>
+              <w:lang w:val="en-US"/>
+            </w:rPr>
+          </w:pPr>
+          <w:hyperlink w:anchor="_Toc225005158" w:history="1">
+            <w:r>
+              <w:rPr>
+                <w:rStyle w:val="Hyperlink"/>
+                <w:noProof/>
+              </w:rPr>
+              <w:t>1.2.</w:t>
+            </w:r>
+            <w:r>
+              <w:rPr>
+                <w:rFonts w:eastAsiaTheme="minorEastAsia"/>
+                <w:noProof/>
+                <w:sz w:val="24"/>
+                <w:szCs w:val="24"/>
+                <w:lang w:val="en-US"/>
+              </w:rPr>
+              <w:tab/>
+            </w:r>
+            <w:r>
+              <w:rPr>
+                <w:rStyle w:val="Hyperlink"/>
+                <w:noProof/>
+              </w:rPr>
+              <w:t>Frontend technológiák</w:t>
+            </w:r>
+            <w:r>
+              <w:rPr>
+                <w:noProof/>
+                <w:webHidden/>
+              </w:rPr>
+              <w:tab/>
+            </w:r>
+            <w:r>
+              <w:rPr>
+                <w:noProof/>
+                <w:webHidden/>
+              </w:rPr>
+              <w:fldChar w:fldCharType="begin"/>
+            </w:r>
+            <w:r>
+              <w:rPr>
+                <w:noProof/>
+                <w:webHidden/>
+              </w:rPr>
+              <w:instrText xml:space="preserve"> PAGEREF _Toc225005158 \h </w:instrText>
+            </w:r>
+            <w:r>
+              <w:rPr>
+                <w:noProof/>
+                <w:webHidden/>
+              </w:rPr>
+            </w:r>
+            <w:r>
+              <w:rPr>
+                <w:noProof/>
+                <w:webHidden/>
+              </w:rPr>
+              <w:fldChar w:fldCharType="separate"/>
+            </w:r>
+            <w:r>
+              <w:rPr>
+                <w:noProof/>
+                <w:webHidden/>
+              </w:rPr>
+              <w:t>5</w:t>
+            </w:r>
+            <w:r>
+              <w:rPr>
+                <w:noProof/>
+                <w:webHidden/>
+              </w:rPr>
+              <w:fldChar w:fldCharType="end"/>
+            </w:r>
+          </w:hyperlink>
+        </w:p>
+        <w:p>
+          <w:pPr>
+            <w:pStyle w:val="TOC2"/>
+            <w:tabs>
+              <w:tab w:val="left" w:pos="960"/>
+              <w:tab w:val="right" w:leader="dot" w:pos="8827"/>
+            </w:tabs>
+            <w:rPr>
+              <w:rFonts w:eastAsiaTheme="minorEastAsia"/>
+              <w:noProof/>
+              <w:sz w:val="24"/>
+              <w:szCs w:val="24"/>
+              <w:lang w:val="en-US"/>
+            </w:rPr>
+          </w:pPr>
+          <w:hyperlink w:anchor="_Toc225005159" w:history="1">
+            <w:r>
+              <w:rPr>
+                <w:rStyle w:val="Hyperlink"/>
+                <w:noProof/>
+              </w:rPr>
+              <w:t>1.3.</w:t>
+            </w:r>
+            <w:r>
+              <w:rPr>
+                <w:rFonts w:eastAsiaTheme="minorEastAsia"/>
+                <w:noProof/>
+                <w:sz w:val="24"/>
+                <w:szCs w:val="24"/>
+                <w:lang w:val="en-US"/>
+              </w:rPr>
+              <w:tab/>
+            </w:r>
+            <w:r>
+              <w:rPr>
+                <w:rStyle w:val="Hyperlink"/>
+                <w:noProof/>
+              </w:rPr>
+              <w:t>Backend technológiák</w:t>
+            </w:r>
+            <w:r>
+              <w:rPr>
+                <w:noProof/>
+                <w:webHidden/>
+              </w:rPr>
+              <w:tab/>
+            </w:r>
+            <w:r>
+              <w:rPr>
+                <w:noProof/>
+                <w:webHidden/>
+              </w:rPr>
+              <w:fldChar w:fldCharType="begin"/>
+            </w:r>
+            <w:r>
+              <w:rPr>
+                <w:noProof/>
+                <w:webHidden/>
+              </w:rPr>
+              <w:instrText xml:space="preserve"> PAGEREF _Toc225005159 \h </w:instrText>
+            </w:r>
+            <w:r>
+              <w:rPr>
+                <w:noProof/>
+                <w:webHidden/>
+              </w:rPr>
+            </w:r>
+            <w:r>
+              <w:rPr>
+                <w:noProof/>
+                <w:webHidden/>
+              </w:rPr>
+              <w:fldChar w:fldCharType="separate"/>
+            </w:r>
+            <w:r>
+              <w:rPr>
+                <w:noProof/>
+                <w:webHidden/>
+              </w:rPr>
+              <w:t>6</w:t>
+            </w:r>
+            <w:r>
+              <w:rPr>
+                <w:noProof/>
+                <w:webHidden/>
+              </w:rPr>
+              <w:fldChar w:fldCharType="end"/>
+            </w:r>
+          </w:hyperlink>
+        </w:p>
+        <w:p>
+          <w:pPr>
+            <w:pStyle w:val="TOC2"/>
+            <w:tabs>
+              <w:tab w:val="left" w:pos="960"/>
+              <w:tab w:val="right" w:leader="dot" w:pos="8827"/>
+            </w:tabs>
+            <w:rPr>
+              <w:rFonts w:eastAsiaTheme="minorEastAsia"/>
+              <w:noProof/>
+              <w:sz w:val="24"/>
+              <w:szCs w:val="24"/>
+              <w:lang w:val="en-US"/>
+            </w:rPr>
+          </w:pPr>
+          <w:hyperlink w:anchor="_Toc225005160" w:history="1">
+            <w:r>
+              <w:rPr>
+                <w:rStyle w:val="Hyperlink"/>
+                <w:noProof/>
+              </w:rPr>
+              <w:t>1.4.</w:t>
+            </w:r>
+            <w:r>
+              <w:rPr>
+                <w:rFonts w:eastAsiaTheme="minorEastAsia"/>
+                <w:noProof/>
+                <w:sz w:val="24"/>
+                <w:szCs w:val="24"/>
+                <w:lang w:val="en-US"/>
+              </w:rPr>
+              <w:tab/>
+            </w:r>
+            <w:r>
+              <w:rPr>
+                <w:rStyle w:val="Hyperlink"/>
+                <w:noProof/>
+              </w:rPr>
+              <w:t>Valós idejű kommunikáció</w:t>
+            </w:r>
+            <w:r>
+              <w:rPr>
+                <w:noProof/>
+                <w:webHidden/>
+              </w:rPr>
+              <w:tab/>
+            </w:r>
+            <w:r>
+              <w:rPr>
+                <w:noProof/>
+                <w:webHidden/>
+              </w:rPr>
+              <w:fldChar w:fldCharType="begin"/>
+            </w:r>
+            <w:r>
+              <w:rPr>
+                <w:noProof/>
+                <w:webHidden/>
+              </w:rPr>
+              <w:instrText xml:space="preserve"> PAGEREF _Toc225005160 \h </w:instrText>
+            </w:r>
+            <w:r>
+              <w:rPr>
+                <w:noProof/>
+                <w:webHidden/>
+              </w:rPr>
+            </w:r>
+            <w:r>
+              <w:rPr>
+                <w:noProof/>
+                <w:webHidden/>
+              </w:rPr>
+              <w:fldChar w:fldCharType="separate"/>
+            </w:r>
+            <w:r>
+              <w:rPr>
+                <w:noProof/>
+                <w:webHidden/>
+              </w:rPr>
+              <w:t>7</w:t>
+            </w:r>
+            <w:r>
+              <w:rPr>
+                <w:noProof/>
+                <w:webHidden/>
+              </w:rPr>
+              <w:fldChar w:fldCharType="end"/>
+            </w:r>
+          </w:hyperlink>
+        </w:p>
+        <w:p>
+          <w:pPr>
+            <w:pStyle w:val="TOC2"/>
+            <w:tabs>
+              <w:tab w:val="left" w:pos="960"/>
+              <w:tab w:val="right" w:leader="dot" w:pos="8827"/>
+            </w:tabs>
+            <w:rPr>
+              <w:rFonts w:eastAsiaTheme="minorEastAsia"/>
+              <w:noProof/>
+              <w:sz w:val="24"/>
+              <w:szCs w:val="24"/>
+              <w:lang w:val="en-US"/>
+            </w:rPr>
+          </w:pPr>
+          <w:hyperlink w:anchor="_Toc225005161" w:history="1">
+            <w:r>
+              <w:rPr>
+                <w:rStyle w:val="Hyperlink"/>
+                <w:noProof/>
+              </w:rPr>
+              <w:t>1.5.</w:t>
+            </w:r>
+            <w:r>
+              <w:rPr>
+                <w:rFonts w:eastAsiaTheme="minorEastAsia"/>
+                <w:noProof/>
+                <w:sz w:val="24"/>
+                <w:szCs w:val="24"/>
+                <w:lang w:val="en-US"/>
+              </w:rPr>
+              <w:tab/>
+            </w:r>
+            <w:r>
+              <w:rPr>
+                <w:rStyle w:val="Hyperlink"/>
+                <w:noProof/>
+              </w:rPr>
+              <w:t>Adatkezelés és tárolás</w:t>
+            </w:r>
+            <w:r>
+              <w:rPr>
+                <w:noProof/>
+                <w:webHidden/>
+              </w:rPr>
+              <w:tab/>
+            </w:r>
+            <w:r>
+              <w:rPr>
+                <w:noProof/>
+                <w:webHidden/>
+              </w:rPr>
+              <w:fldChar w:fldCharType="begin"/>
+            </w:r>
+            <w:r>
+              <w:rPr>
+                <w:noProof/>
+                <w:webHidden/>
+              </w:rPr>
+              <w:instrText xml:space="preserve"> PAGEREF _Toc225005161 \h </w:instrText>
+            </w:r>
+            <w:r>
+              <w:rPr>
+                <w:noProof/>
+                <w:webHidden/>
+              </w:rPr>
+            </w:r>
+            <w:r>
+              <w:rPr>
+                <w:noProof/>
+                <w:webHidden/>
+              </w:rPr>
+              <w:fldChar w:fldCharType="separate"/>
+            </w:r>
+            <w:r>
+              <w:rPr>
+                <w:noProof/>
+                <w:webHidden/>
+              </w:rPr>
+              <w:t>8</w:t>
+            </w:r>
+            <w:r>
+              <w:rPr>
+                <w:noProof/>
+                <w:webHidden/>
+              </w:rPr>
+              <w:fldChar w:fldCharType="end"/>
+            </w:r>
+          </w:hyperlink>
+        </w:p>
+        <w:p>
+          <w:pPr>
+            <w:pStyle w:val="TOC2"/>
+            <w:tabs>
+              <w:tab w:val="left" w:pos="960"/>
+              <w:tab w:val="right" w:leader="dot" w:pos="8827"/>
+            </w:tabs>
+            <w:rPr>
+              <w:rFonts w:eastAsiaTheme="minorEastAsia"/>
+              <w:noProof/>
+              <w:sz w:val="24"/>
+              <w:szCs w:val="24"/>
+              <w:lang w:val="en-US"/>
+            </w:rPr>
+          </w:pPr>
+          <w:hyperlink w:anchor="_Toc225005162" w:history="1">
+            <w:r>
+              <w:rPr>
+                <w:rStyle w:val="Hyperlink"/>
+                <w:noProof/>
+              </w:rPr>
+              <w:t>1.6.</w:t>
+            </w:r>
+            <w:r>
+              <w:rPr>
+                <w:rFonts w:eastAsiaTheme="minorEastAsia"/>
+                <w:noProof/>
+                <w:sz w:val="24"/>
+                <w:szCs w:val="24"/>
+                <w:lang w:val="en-US"/>
+              </w:rPr>
+              <w:tab/>
+            </w:r>
+            <w:r>
+              <w:rPr>
+                <w:rStyle w:val="Hyperlink"/>
+                <w:noProof/>
+              </w:rPr>
+              <w:t>MI integráció</w:t>
+            </w:r>
+            <w:r>
+              <w:rPr>
+                <w:noProof/>
+                <w:webHidden/>
+              </w:rPr>
+              <w:tab/>
+            </w:r>
+            <w:r>
+              <w:rPr>
+                <w:noProof/>
+                <w:webHidden/>
+              </w:rPr>
+              <w:fldChar w:fldCharType="begin"/>
+            </w:r>
+            <w:r>
+              <w:rPr>
+                <w:noProof/>
+                <w:webHidden/>
+              </w:rPr>
+              <w:instrText xml:space="preserve"> PAGEREF _Toc225005162 \h </w:instrText>
+            </w:r>
+            <w:r>
+              <w:rPr>
+                <w:noProof/>
+                <w:webHidden/>
+              </w:rPr>
+            </w:r>
+            <w:r>
+              <w:rPr>
+                <w:noProof/>
+                <w:webHidden/>
+              </w:rPr>
+              <w:fldChar w:fldCharType="separate"/>
+            </w:r>
+            <w:r>
+              <w:rPr>
+                <w:noProof/>
+                <w:webHidden/>
+              </w:rPr>
+              <w:t>9</w:t>
+            </w:r>
+            <w:r>
+              <w:rPr>
+                <w:noProof/>
+                <w:webHidden/>
+              </w:rPr>
+              <w:fldChar w:fldCharType="end"/>
+            </w:r>
+          </w:hyperlink>
+        </w:p>
+        <w:p>
+          <w:r>
+            <w:rPr>
+              <w:b/>
+              <w:bCs/>
+              <w:noProof/>
+            </w:rPr>
+            <w:fldChar w:fldCharType="end"/>
+          </w:r>
+        </w:p>
+      </w:sdtContent>
+    </w:sdt>
+    <w:p>
+      <w:pPr>
+        <w:spacing w:line="360" w:lineRule="auto"/>
+        <w:jc w:val="both"/>
+        <w:rPr>
+          <w:rFonts w:ascii="Times New Roman" w:hAnsi="Times New Roman" w:cs="Times New Roman"/>
+          <w:sz w:val="24"/>
+          <w:szCs w:val="24"/>
+        </w:rPr>
+      </w:pPr>
+    </w:p>
+    <w:p>
+      <w:pPr>
+        <w:spacing w:line="360" w:lineRule="auto"/>
+        <w:jc w:val="both"/>
+        <w:rPr>
+          <w:rFonts w:ascii="Times New Roman" w:hAnsi="Times New Roman" w:cs="Times New Roman"/>
+          <w:sz w:val="24"/>
+          <w:szCs w:val="24"/>
+        </w:rPr>
+      </w:pPr>
+    </w:p>
+    <w:p>
+      <w:pPr>
+        <w:spacing w:line="360" w:lineRule="auto"/>
+        <w:jc w:val="both"/>
+        <w:rPr>
+          <w:rFonts w:ascii="Times New Roman" w:hAnsi="Times New Roman" w:cs="Times New Roman"/>
+          <w:color w:val="EE0000"/>
+          <w:sz w:val="24"/>
+          <w:szCs w:val="24"/>
+        </w:rPr>
+      </w:pPr>
+      <w:r>
+        <w:rPr>
+          <w:rFonts w:ascii="Times New Roman" w:hAnsi="Times New Roman" w:cs="Times New Roman"/>
+          <w:color w:val="EE0000"/>
+          <w:sz w:val="24"/>
+          <w:szCs w:val="24"/>
+        </w:rPr>
+        <w:t>Architektúra</w:t>
+      </w:r>
+    </w:p>
+    <w:p>
+      <w:pPr>
+        <w:spacing w:line="360" w:lineRule="auto"/>
+        <w:jc w:val="both"/>
+        <w:rPr>
+          <w:rFonts w:ascii="Times New Roman" w:hAnsi="Times New Roman" w:cs="Times New Roman"/>
+          <w:color w:val="EE0000"/>
+          <w:sz w:val="24"/>
+          <w:szCs w:val="24"/>
+        </w:rPr>
+      </w:pPr>
+      <w:r>
+        <w:rPr>
+          <w:rFonts w:ascii="Times New Roman" w:hAnsi="Times New Roman" w:cs="Times New Roman"/>
+          <w:color w:val="EE0000"/>
+          <w:sz w:val="24"/>
+          <w:szCs w:val="24"/>
+        </w:rPr>
+        <w:tab/>
+        <w:t>Adatbázis felépítés – relációk</w:t>
+      </w:r>
+      <w:r>
+        <w:rPr>
+          <w:rFonts w:ascii="Times New Roman" w:hAnsi="Times New Roman" w:cs="Times New Roman"/>
+          <w:color w:val="EE0000"/>
+          <w:sz w:val="24"/>
+          <w:szCs w:val="24"/>
+        </w:rPr>
+        <w:t xml:space="preserve"> – entitások</w:t>
+      </w:r>
+    </w:p>
+    <w:p>
+      <w:pPr>
+        <w:spacing w:line="360" w:lineRule="auto"/>
+        <w:jc w:val="both"/>
+        <w:rPr>
+          <w:rFonts w:ascii="Times New Roman" w:hAnsi="Times New Roman" w:cs="Times New Roman"/>
+          <w:color w:val="EE0000"/>
+          <w:sz w:val="24"/>
+          <w:szCs w:val="24"/>
+        </w:rPr>
+      </w:pPr>
+      <w:r>
+        <w:rPr>
+          <w:rFonts w:ascii="Times New Roman" w:hAnsi="Times New Roman" w:cs="Times New Roman"/>
+          <w:color w:val="EE0000"/>
+          <w:sz w:val="24"/>
+          <w:szCs w:val="24"/>
+        </w:rPr>
+        <w:tab/>
+        <w:t xml:space="preserve">Kommunikáció, API és a </w:t>
+      </w:r>
+      <w:proofErr w:type="spellStart"/>
+      <w:r>
+        <w:rPr>
+          <w:rFonts w:ascii="Times New Roman" w:hAnsi="Times New Roman" w:cs="Times New Roman"/>
+          <w:color w:val="EE0000"/>
+          <w:sz w:val="24"/>
+          <w:szCs w:val="24"/>
+        </w:rPr>
+        <w:t>websocket</w:t>
+      </w:r>
+      <w:proofErr w:type="spellEnd"/>
+    </w:p>
+    <w:p>
+      <w:pPr>
+        <w:spacing w:line="360" w:lineRule="auto"/>
+        <w:jc w:val="both"/>
+        <w:rPr>
+          <w:rFonts w:ascii="Times New Roman" w:hAnsi="Times New Roman" w:cs="Times New Roman"/>
+          <w:color w:val="EE0000"/>
+          <w:sz w:val="24"/>
+          <w:szCs w:val="24"/>
+        </w:rPr>
+      </w:pPr>
+      <w:r>
+        <w:rPr>
+          <w:rFonts w:ascii="Times New Roman" w:hAnsi="Times New Roman" w:cs="Times New Roman"/>
+          <w:color w:val="EE0000"/>
+          <w:sz w:val="24"/>
+          <w:szCs w:val="24"/>
+        </w:rPr>
+        <w:tab/>
+        <w:t xml:space="preserve">Biztonság, JWT </w:t>
+      </w:r>
+      <w:proofErr w:type="spellStart"/>
+      <w:r>
+        <w:rPr>
+          <w:rFonts w:ascii="Times New Roman" w:hAnsi="Times New Roman" w:cs="Times New Roman"/>
+          <w:color w:val="EE0000"/>
+          <w:sz w:val="24"/>
+          <w:szCs w:val="24"/>
+        </w:rPr>
+        <w:t>token</w:t>
+      </w:r>
+      <w:proofErr w:type="spellEnd"/>
+      <w:r>
+        <w:rPr>
+          <w:rFonts w:ascii="Times New Roman" w:hAnsi="Times New Roman" w:cs="Times New Roman"/>
+          <w:color w:val="EE0000"/>
+          <w:sz w:val="24"/>
+          <w:szCs w:val="24"/>
+        </w:rPr>
+        <w:t xml:space="preserve"> </w:t>
+      </w:r>
+      <w:proofErr w:type="spellStart"/>
+      <w:r>
+        <w:rPr>
+          <w:rFonts w:ascii="Times New Roman" w:hAnsi="Times New Roman" w:cs="Times New Roman"/>
+          <w:color w:val="EE0000"/>
+          <w:sz w:val="24"/>
+          <w:szCs w:val="24"/>
+        </w:rPr>
+        <w:t>authentikáció</w:t>
+      </w:r>
+      <w:proofErr w:type="spellEnd"/>
+      <w:r>
+        <w:rPr>
+          <w:rFonts w:ascii="Times New Roman" w:hAnsi="Times New Roman" w:cs="Times New Roman"/>
+          <w:color w:val="EE0000"/>
+          <w:sz w:val="24"/>
+          <w:szCs w:val="24"/>
+        </w:rPr>
+        <w:t xml:space="preserve"> </w:t>
+      </w:r>
+    </w:p>
+    <w:p>
+      <w:pPr>
+        <w:spacing w:line="360" w:lineRule="auto"/>
+        <w:jc w:val="both"/>
+        <w:rPr>
+          <w:rFonts w:ascii="Times New Roman" w:hAnsi="Times New Roman" w:cs="Times New Roman"/>
+          <w:color w:val="EE0000"/>
+          <w:sz w:val="24"/>
+          <w:szCs w:val="24"/>
+        </w:rPr>
+      </w:pPr>
+      <w:r>
+        <w:rPr>
+          <w:rFonts w:ascii="Times New Roman" w:hAnsi="Times New Roman" w:cs="Times New Roman"/>
+          <w:color w:val="EE0000"/>
+          <w:sz w:val="24"/>
+          <w:szCs w:val="24"/>
+        </w:rPr>
+        <w:t>Pálya generálása</w:t>
+      </w:r>
+    </w:p>
+    <w:p>
+      <w:pPr>
+        <w:spacing w:line="360" w:lineRule="auto"/>
+        <w:ind w:firstLine="720"/>
+        <w:jc w:val="both"/>
+        <w:rPr>
+          <w:rFonts w:ascii="Times New Roman" w:hAnsi="Times New Roman" w:cs="Times New Roman"/>
+          <w:color w:val="EE0000"/>
+          <w:sz w:val="24"/>
+          <w:szCs w:val="24"/>
+        </w:rPr>
+      </w:pPr>
+      <w:r>
+        <w:rPr>
+          <w:rFonts w:ascii="Times New Roman" w:hAnsi="Times New Roman" w:cs="Times New Roman"/>
+          <w:color w:val="EE0000"/>
+          <w:sz w:val="24"/>
+          <w:szCs w:val="24"/>
+        </w:rPr>
+        <w:t xml:space="preserve">Generikus </w:t>
+      </w:r>
+      <w:r>
+        <w:rPr>
+          <w:rFonts w:ascii="Times New Roman" w:hAnsi="Times New Roman" w:cs="Times New Roman"/>
+          <w:color w:val="EE0000"/>
+          <w:sz w:val="24"/>
+          <w:szCs w:val="24"/>
+        </w:rPr>
+        <w:t>játék modellek</w:t>
+      </w:r>
+    </w:p>
+    <w:p>
+      <w:pPr>
+        <w:spacing w:line="360" w:lineRule="auto"/>
+        <w:ind w:firstLine="720"/>
+        <w:jc w:val="both"/>
+        <w:rPr>
+          <w:rFonts w:ascii="Times New Roman" w:hAnsi="Times New Roman" w:cs="Times New Roman"/>
+          <w:color w:val="EE0000"/>
+          <w:sz w:val="24"/>
+          <w:szCs w:val="24"/>
+        </w:rPr>
+      </w:pPr>
+      <w:r>
+        <w:rPr>
+          <w:rFonts w:ascii="Times New Roman" w:hAnsi="Times New Roman" w:cs="Times New Roman"/>
+          <w:color w:val="EE0000"/>
+          <w:sz w:val="24"/>
+          <w:szCs w:val="24"/>
+        </w:rPr>
+        <w:t xml:space="preserve">Gráf alapú struktúra </w:t>
+      </w:r>
+      <w:proofErr w:type="spellStart"/>
+      <w:r>
+        <w:rPr>
+          <w:rFonts w:ascii="Times New Roman" w:hAnsi="Times New Roman" w:cs="Times New Roman"/>
+          <w:color w:val="EE0000"/>
+          <w:sz w:val="24"/>
+          <w:szCs w:val="24"/>
+        </w:rPr>
+        <w:t>deffiniálása</w:t>
+      </w:r>
+      <w:proofErr w:type="spellEnd"/>
+    </w:p>
+    <w:p>
+      <w:pPr>
+        <w:spacing w:line="360" w:lineRule="auto"/>
+        <w:ind w:firstLine="720"/>
+        <w:jc w:val="both"/>
+        <w:rPr>
+          <w:rFonts w:ascii="Times New Roman" w:hAnsi="Times New Roman" w:cs="Times New Roman"/>
+          <w:color w:val="EE0000"/>
+          <w:sz w:val="24"/>
+          <w:szCs w:val="24"/>
+        </w:rPr>
+      </w:pPr>
+      <w:proofErr w:type="spellStart"/>
+      <w:r>
+        <w:rPr>
+          <w:rFonts w:ascii="Times New Roman" w:hAnsi="Times New Roman" w:cs="Times New Roman"/>
+          <w:color w:val="EE0000"/>
+          <w:sz w:val="24"/>
+          <w:szCs w:val="24"/>
+        </w:rPr>
+        <w:t>Promtolás</w:t>
+      </w:r>
+      <w:proofErr w:type="spellEnd"/>
+      <w:r>
+        <w:rPr>
+          <w:rFonts w:ascii="Times New Roman" w:hAnsi="Times New Roman" w:cs="Times New Roman"/>
+          <w:color w:val="EE0000"/>
+          <w:sz w:val="24"/>
+          <w:szCs w:val="24"/>
+        </w:rPr>
+        <w:t>, kipróbált és használt modellek</w:t>
+      </w:r>
+      <w:r>
+        <w:rPr>
+          <w:rFonts w:ascii="Times New Roman" w:hAnsi="Times New Roman" w:cs="Times New Roman"/>
+          <w:color w:val="EE0000"/>
+          <w:sz w:val="24"/>
+          <w:szCs w:val="24"/>
+        </w:rPr>
+        <w:t xml:space="preserve">, </w:t>
+      </w:r>
+      <w:r>
+        <w:rPr>
+          <w:rFonts w:ascii="Times New Roman" w:hAnsi="Times New Roman" w:cs="Times New Roman"/>
+          <w:color w:val="EE0000"/>
+          <w:sz w:val="24"/>
+          <w:szCs w:val="24"/>
+        </w:rPr>
+        <w:t>Prompt mint fekete mágia</w:t>
+      </w:r>
+    </w:p>
+    <w:p>
+      <w:pPr>
+        <w:spacing w:line="360" w:lineRule="auto"/>
+        <w:jc w:val="both"/>
+        <w:rPr>
+          <w:rFonts w:ascii="Times New Roman" w:hAnsi="Times New Roman" w:cs="Times New Roman"/>
+          <w:color w:val="EE0000"/>
+          <w:sz w:val="24"/>
+          <w:szCs w:val="24"/>
+        </w:rPr>
+      </w:pPr>
+      <w:r>
+        <w:rPr>
+          <w:rFonts w:ascii="Times New Roman" w:hAnsi="Times New Roman" w:cs="Times New Roman"/>
+          <w:color w:val="EE0000"/>
+          <w:sz w:val="24"/>
+          <w:szCs w:val="24"/>
+        </w:rPr>
+        <w:tab/>
+        <w:t xml:space="preserve">Milyen folyamatok és miért </w:t>
+      </w:r>
+      <w:proofErr w:type="spellStart"/>
+      <w:r>
+        <w:rPr>
+          <w:rFonts w:ascii="Times New Roman" w:hAnsi="Times New Roman" w:cs="Times New Roman"/>
+          <w:color w:val="EE0000"/>
+          <w:sz w:val="24"/>
+          <w:szCs w:val="24"/>
+        </w:rPr>
+        <w:t>csatolódtak</w:t>
+      </w:r>
+      <w:proofErr w:type="spellEnd"/>
+      <w:r>
+        <w:rPr>
+          <w:rFonts w:ascii="Times New Roman" w:hAnsi="Times New Roman" w:cs="Times New Roman"/>
+          <w:color w:val="EE0000"/>
+          <w:sz w:val="24"/>
+          <w:szCs w:val="24"/>
+        </w:rPr>
+        <w:t xml:space="preserve"> rá a pálya generálásra, hint rendszer</w:t>
+      </w:r>
+    </w:p>
+    <w:p>
+      <w:pPr>
+        <w:spacing w:line="360" w:lineRule="auto"/>
+        <w:jc w:val="both"/>
+        <w:rPr>
+          <w:rFonts w:ascii="Times New Roman" w:hAnsi="Times New Roman" w:cs="Times New Roman"/>
+          <w:color w:val="EE0000"/>
+          <w:sz w:val="24"/>
+          <w:szCs w:val="24"/>
+        </w:rPr>
+      </w:pPr>
+      <w:r>
+        <w:rPr>
+          <w:rFonts w:ascii="Times New Roman" w:hAnsi="Times New Roman" w:cs="Times New Roman"/>
+          <w:color w:val="EE0000"/>
+          <w:sz w:val="24"/>
+          <w:szCs w:val="24"/>
+        </w:rPr>
+        <w:tab/>
+        <w:t>Milyen modelleket használtam végül</w:t>
+      </w:r>
+    </w:p>
+    <w:p>
+      <w:pPr>
+        <w:spacing w:line="360" w:lineRule="auto"/>
+        <w:jc w:val="both"/>
+        <w:rPr>
+          <w:rFonts w:ascii="Times New Roman" w:hAnsi="Times New Roman" w:cs="Times New Roman"/>
+          <w:color w:val="EE0000"/>
+          <w:sz w:val="24"/>
+          <w:szCs w:val="24"/>
+        </w:rPr>
+      </w:pPr>
+      <w:r>
+        <w:rPr>
+          <w:rFonts w:ascii="Times New Roman" w:hAnsi="Times New Roman" w:cs="Times New Roman"/>
+          <w:color w:val="EE0000"/>
+          <w:sz w:val="24"/>
+          <w:szCs w:val="24"/>
+        </w:rPr>
+        <w:tab/>
+      </w:r>
+      <w:proofErr w:type="spellStart"/>
+      <w:r>
+        <w:rPr>
+          <w:rFonts w:ascii="Times New Roman" w:hAnsi="Times New Roman" w:cs="Times New Roman"/>
+          <w:color w:val="EE0000"/>
+          <w:sz w:val="24"/>
+          <w:szCs w:val="24"/>
+        </w:rPr>
+        <w:t>Sprite</w:t>
+      </w:r>
+      <w:proofErr w:type="spellEnd"/>
+      <w:r>
+        <w:rPr>
+          <w:rFonts w:ascii="Times New Roman" w:hAnsi="Times New Roman" w:cs="Times New Roman"/>
+          <w:color w:val="EE0000"/>
+          <w:sz w:val="24"/>
+          <w:szCs w:val="24"/>
+        </w:rPr>
+        <w:t xml:space="preserve"> </w:t>
+      </w:r>
+      <w:proofErr w:type="spellStart"/>
+      <w:r>
+        <w:rPr>
+          <w:rFonts w:ascii="Times New Roman" w:hAnsi="Times New Roman" w:cs="Times New Roman"/>
+          <w:color w:val="EE0000"/>
+          <w:sz w:val="24"/>
+          <w:szCs w:val="24"/>
+        </w:rPr>
+        <w:t>png</w:t>
+      </w:r>
+      <w:proofErr w:type="spellEnd"/>
+      <w:r>
+        <w:rPr>
+          <w:rFonts w:ascii="Times New Roman" w:hAnsi="Times New Roman" w:cs="Times New Roman"/>
+          <w:color w:val="EE0000"/>
+          <w:sz w:val="24"/>
+          <w:szCs w:val="24"/>
+        </w:rPr>
+        <w:t xml:space="preserve"> </w:t>
+      </w:r>
+      <w:proofErr w:type="gramStart"/>
+      <w:r>
+        <w:rPr>
+          <w:rFonts w:ascii="Times New Roman" w:hAnsi="Times New Roman" w:cs="Times New Roman"/>
+          <w:color w:val="EE0000"/>
+          <w:sz w:val="24"/>
+          <w:szCs w:val="24"/>
+        </w:rPr>
+        <w:t>generálása</w:t>
+      </w:r>
+      <w:proofErr w:type="gramEnd"/>
+      <w:r>
+        <w:rPr>
+          <w:rFonts w:ascii="Times New Roman" w:hAnsi="Times New Roman" w:cs="Times New Roman"/>
+          <w:color w:val="EE0000"/>
+          <w:sz w:val="24"/>
+          <w:szCs w:val="24"/>
+        </w:rPr>
+        <w:t xml:space="preserve"> amit végül a modell megoldott</w:t>
+      </w:r>
+    </w:p>
+    <w:p>
+      <w:pPr>
+        <w:spacing w:line="360" w:lineRule="auto"/>
+        <w:jc w:val="both"/>
+        <w:rPr>
+          <w:rFonts w:ascii="Times New Roman" w:hAnsi="Times New Roman" w:cs="Times New Roman"/>
+          <w:color w:val="EE0000"/>
+          <w:sz w:val="24"/>
+          <w:szCs w:val="24"/>
+        </w:rPr>
+      </w:pPr>
+      <w:r>
+        <w:rPr>
+          <w:rFonts w:ascii="Times New Roman" w:hAnsi="Times New Roman" w:cs="Times New Roman"/>
+          <w:color w:val="EE0000"/>
+          <w:sz w:val="24"/>
+          <w:szCs w:val="24"/>
+        </w:rPr>
+        <w:t>Költség elemzés</w:t>
+      </w:r>
+    </w:p>
+    <w:p>
+      <w:pPr>
+        <w:spacing w:line="360" w:lineRule="auto"/>
+        <w:jc w:val="both"/>
+        <w:rPr>
+          <w:rFonts w:ascii="Times New Roman" w:hAnsi="Times New Roman" w:cs="Times New Roman"/>
+          <w:color w:val="EE0000"/>
+          <w:sz w:val="24"/>
+          <w:szCs w:val="24"/>
+        </w:rPr>
+      </w:pPr>
+      <w:r>
+        <w:rPr>
+          <w:rFonts w:ascii="Times New Roman" w:hAnsi="Times New Roman" w:cs="Times New Roman"/>
+          <w:color w:val="EE0000"/>
+          <w:sz w:val="24"/>
+          <w:szCs w:val="24"/>
+        </w:rPr>
+        <w:tab/>
+        <w:t>Mérési eredmények - statisztikák</w:t>
+      </w:r>
+    </w:p>
+    <w:p>
+      <w:pPr>
+        <w:spacing w:line="360" w:lineRule="auto"/>
+        <w:jc w:val="both"/>
+        <w:rPr>
+          <w:rFonts w:ascii="Times New Roman" w:hAnsi="Times New Roman" w:cs="Times New Roman"/>
+          <w:color w:val="EE0000"/>
+          <w:sz w:val="24"/>
+          <w:szCs w:val="24"/>
+        </w:rPr>
+      </w:pPr>
+      <w:r>
+        <w:rPr>
+          <w:rFonts w:ascii="Times New Roman" w:hAnsi="Times New Roman" w:cs="Times New Roman"/>
+          <w:color w:val="EE0000"/>
+          <w:sz w:val="24"/>
+          <w:szCs w:val="24"/>
+        </w:rPr>
+        <w:tab/>
+        <w:t>Milyen költsége van egy pálya generálásának</w:t>
+      </w:r>
+    </w:p>
+    <w:p>
+      <w:pPr>
+        <w:spacing w:line="360" w:lineRule="auto"/>
+        <w:jc w:val="both"/>
+        <w:rPr>
+          <w:rFonts w:ascii="Times New Roman" w:hAnsi="Times New Roman" w:cs="Times New Roman"/>
+          <w:color w:val="EE0000"/>
+          <w:sz w:val="24"/>
+          <w:szCs w:val="24"/>
+        </w:rPr>
+      </w:pPr>
+      <w:r>
+        <w:rPr>
+          <w:rFonts w:ascii="Times New Roman" w:hAnsi="Times New Roman" w:cs="Times New Roman"/>
+          <w:color w:val="EE0000"/>
+          <w:sz w:val="24"/>
+          <w:szCs w:val="24"/>
+        </w:rPr>
+        <w:tab/>
+        <w:t>Modell alternatívák, saját hardware-en való futtatás</w:t>
+      </w:r>
+    </w:p>
+    <w:p>
+      <w:pPr>
+        <w:spacing w:line="360" w:lineRule="auto"/>
+        <w:jc w:val="both"/>
+        <w:rPr>
+          <w:rFonts w:ascii="Times New Roman" w:hAnsi="Times New Roman" w:cs="Times New Roman"/>
+          <w:color w:val="EE0000"/>
+          <w:sz w:val="24"/>
+          <w:szCs w:val="24"/>
+        </w:rPr>
+      </w:pPr>
+      <w:r>
+        <w:rPr>
+          <w:rFonts w:ascii="Times New Roman" w:hAnsi="Times New Roman" w:cs="Times New Roman"/>
+          <w:color w:val="EE0000"/>
+          <w:sz w:val="24"/>
+          <w:szCs w:val="24"/>
+        </w:rPr>
+        <w:t>Frontend és felhasználói felületek</w:t>
+      </w:r>
+    </w:p>
+    <w:p>
+      <w:pPr>
+        <w:spacing w:line="360" w:lineRule="auto"/>
+        <w:ind w:firstLine="720"/>
+        <w:jc w:val="both"/>
+        <w:rPr>
+          <w:rFonts w:ascii="Times New Roman" w:hAnsi="Times New Roman" w:cs="Times New Roman"/>
+          <w:color w:val="EE0000"/>
+          <w:sz w:val="24"/>
+          <w:szCs w:val="24"/>
+        </w:rPr>
+      </w:pPr>
+      <w:r>
+        <w:rPr>
+          <w:rFonts w:ascii="Times New Roman" w:hAnsi="Times New Roman" w:cs="Times New Roman"/>
+          <w:color w:val="EE0000"/>
+          <w:sz w:val="24"/>
+          <w:szCs w:val="24"/>
+        </w:rPr>
+        <w:t>Bejelentkezés/Regisztráció</w:t>
+      </w:r>
+    </w:p>
+    <w:p>
+      <w:pPr>
+        <w:spacing w:line="360" w:lineRule="auto"/>
+        <w:jc w:val="both"/>
+        <w:rPr>
+          <w:rFonts w:ascii="Times New Roman" w:hAnsi="Times New Roman" w:cs="Times New Roman"/>
+          <w:color w:val="EE0000"/>
+          <w:sz w:val="24"/>
+          <w:szCs w:val="24"/>
+        </w:rPr>
+      </w:pPr>
+      <w:r>
+        <w:rPr>
+          <w:rFonts w:ascii="Times New Roman" w:hAnsi="Times New Roman" w:cs="Times New Roman"/>
+          <w:color w:val="EE0000"/>
+          <w:sz w:val="24"/>
+          <w:szCs w:val="24"/>
+        </w:rPr>
+        <w:tab/>
+        <w:t xml:space="preserve">Pálya generálás – </w:t>
+      </w:r>
+      <w:proofErr w:type="spellStart"/>
+      <w:r>
+        <w:rPr>
+          <w:rFonts w:ascii="Times New Roman" w:hAnsi="Times New Roman" w:cs="Times New Roman"/>
+          <w:color w:val="EE0000"/>
+          <w:sz w:val="24"/>
+          <w:szCs w:val="24"/>
+        </w:rPr>
+        <w:t>Token</w:t>
+      </w:r>
+      <w:proofErr w:type="spellEnd"/>
+      <w:r>
+        <w:rPr>
+          <w:rFonts w:ascii="Times New Roman" w:hAnsi="Times New Roman" w:cs="Times New Roman"/>
+          <w:color w:val="EE0000"/>
+          <w:sz w:val="24"/>
+          <w:szCs w:val="24"/>
+        </w:rPr>
+        <w:t xml:space="preserve"> rendszer</w:t>
+      </w:r>
+    </w:p>
+    <w:p>
+      <w:pPr>
+        <w:spacing w:line="360" w:lineRule="auto"/>
+        <w:jc w:val="both"/>
+        <w:rPr>
+          <w:rFonts w:ascii="Times New Roman" w:hAnsi="Times New Roman" w:cs="Times New Roman"/>
+          <w:color w:val="EE0000"/>
+          <w:sz w:val="24"/>
+          <w:szCs w:val="24"/>
+        </w:rPr>
+      </w:pPr>
+      <w:r>
+        <w:rPr>
+          <w:rFonts w:ascii="Times New Roman" w:hAnsi="Times New Roman" w:cs="Times New Roman"/>
+          <w:color w:val="EE0000"/>
+          <w:sz w:val="24"/>
+          <w:szCs w:val="24"/>
+        </w:rPr>
+        <w:lastRenderedPageBreak/>
+        <w:tab/>
+        <w:t>Pályák böngészése</w:t>
+      </w:r>
+    </w:p>
+    <w:p>
+      <w:pPr>
+        <w:spacing w:line="360" w:lineRule="auto"/>
+        <w:jc w:val="both"/>
+        <w:rPr>
+          <w:rFonts w:ascii="Times New Roman" w:hAnsi="Times New Roman" w:cs="Times New Roman"/>
+          <w:color w:val="EE0000"/>
+          <w:sz w:val="24"/>
+          <w:szCs w:val="24"/>
+        </w:rPr>
+      </w:pPr>
+      <w:r>
+        <w:rPr>
+          <w:rFonts w:ascii="Times New Roman" w:hAnsi="Times New Roman" w:cs="Times New Roman"/>
+          <w:color w:val="EE0000"/>
+          <w:sz w:val="24"/>
+          <w:szCs w:val="24"/>
+        </w:rPr>
+        <w:tab/>
+        <w:t>Game UI bemutatása</w:t>
+      </w:r>
+    </w:p>
+    <w:p>
+      <w:pPr>
+        <w:spacing w:line="360" w:lineRule="auto"/>
+        <w:jc w:val="both"/>
+        <w:rPr>
+          <w:rFonts w:ascii="Times New Roman" w:hAnsi="Times New Roman" w:cs="Times New Roman"/>
+          <w:color w:val="EE0000"/>
+          <w:sz w:val="24"/>
+          <w:szCs w:val="24"/>
+        </w:rPr>
+      </w:pPr>
+      <w:r>
+        <w:rPr>
+          <w:rFonts w:ascii="Times New Roman" w:hAnsi="Times New Roman" w:cs="Times New Roman"/>
+          <w:color w:val="EE0000"/>
+          <w:sz w:val="24"/>
+          <w:szCs w:val="24"/>
+        </w:rPr>
+        <w:t>Tovább fejlesztési lehetőségek</w:t>
+      </w:r>
+    </w:p>
+    <w:p>
+      <w:pPr>
+        <w:spacing w:line="360" w:lineRule="auto"/>
+        <w:jc w:val="both"/>
+        <w:rPr>
+          <w:rFonts w:ascii="Times New Roman" w:hAnsi="Times New Roman" w:cs="Times New Roman"/>
+          <w:color w:val="EE0000"/>
+          <w:sz w:val="24"/>
+          <w:szCs w:val="24"/>
+        </w:rPr>
+      </w:pPr>
+      <w:r>
+        <w:rPr>
+          <w:rFonts w:ascii="Times New Roman" w:hAnsi="Times New Roman" w:cs="Times New Roman"/>
+          <w:color w:val="EE0000"/>
+          <w:sz w:val="24"/>
+          <w:szCs w:val="24"/>
+        </w:rPr>
+        <w:tab/>
+        <w:t xml:space="preserve">Több szoba, több logikai feladat, ezeknek jelenlegi AI </w:t>
+      </w:r>
+      <w:proofErr w:type="spellStart"/>
+      <w:r>
+        <w:rPr>
+          <w:rFonts w:ascii="Times New Roman" w:hAnsi="Times New Roman" w:cs="Times New Roman"/>
+          <w:color w:val="EE0000"/>
+          <w:sz w:val="24"/>
+          <w:szCs w:val="24"/>
+        </w:rPr>
+        <w:t>json</w:t>
+      </w:r>
+      <w:proofErr w:type="spellEnd"/>
+      <w:r>
+        <w:rPr>
+          <w:rFonts w:ascii="Times New Roman" w:hAnsi="Times New Roman" w:cs="Times New Roman"/>
+          <w:color w:val="EE0000"/>
+          <w:sz w:val="24"/>
+          <w:szCs w:val="24"/>
+        </w:rPr>
+        <w:t xml:space="preserve"> generálás korlátjai</w:t>
+      </w:r>
+    </w:p>
+    <w:p>
+      <w:pPr>
+        <w:spacing w:line="360" w:lineRule="auto"/>
+        <w:jc w:val="both"/>
+        <w:rPr>
+          <w:rFonts w:ascii="Times New Roman" w:hAnsi="Times New Roman" w:cs="Times New Roman"/>
+          <w:color w:val="EE0000"/>
+          <w:sz w:val="24"/>
+          <w:szCs w:val="24"/>
+        </w:rPr>
+      </w:pPr>
+      <w:r>
+        <w:rPr>
+          <w:rFonts w:ascii="Times New Roman" w:hAnsi="Times New Roman" w:cs="Times New Roman"/>
+          <w:color w:val="EE0000"/>
+          <w:sz w:val="24"/>
+          <w:szCs w:val="24"/>
+        </w:rPr>
+        <w:tab/>
+        <w:t>Célzott feltanítás szabaduló szobákba</w:t>
+      </w:r>
+    </w:p>
+    <w:p>
+      <w:pPr>
+        <w:spacing w:line="360" w:lineRule="auto"/>
+        <w:jc w:val="both"/>
+        <w:rPr>
+          <w:rFonts w:ascii="Times New Roman" w:hAnsi="Times New Roman" w:cs="Times New Roman"/>
+          <w:color w:val="EE0000"/>
+          <w:sz w:val="24"/>
+          <w:szCs w:val="24"/>
+        </w:rPr>
+      </w:pPr>
+      <w:r>
+        <w:rPr>
+          <w:rFonts w:ascii="Times New Roman" w:hAnsi="Times New Roman" w:cs="Times New Roman"/>
+          <w:color w:val="EE0000"/>
+          <w:sz w:val="24"/>
+          <w:szCs w:val="24"/>
+        </w:rPr>
+        <w:tab/>
+        <w:t xml:space="preserve">Dinamikus </w:t>
+      </w:r>
+      <w:proofErr w:type="spellStart"/>
+      <w:r>
+        <w:rPr>
+          <w:rFonts w:ascii="Times New Roman" w:hAnsi="Times New Roman" w:cs="Times New Roman"/>
+          <w:color w:val="EE0000"/>
+          <w:sz w:val="24"/>
+          <w:szCs w:val="24"/>
+        </w:rPr>
+        <w:t>js</w:t>
+      </w:r>
+      <w:proofErr w:type="spellEnd"/>
+      <w:r>
+        <w:rPr>
+          <w:rFonts w:ascii="Times New Roman" w:hAnsi="Times New Roman" w:cs="Times New Roman"/>
+          <w:color w:val="EE0000"/>
+          <w:sz w:val="24"/>
+          <w:szCs w:val="24"/>
+        </w:rPr>
+        <w:t xml:space="preserve"> generálás</w:t>
+      </w:r>
+    </w:p>
+    <w:p>
+      <w:pPr>
+        <w:spacing w:line="360" w:lineRule="auto"/>
+        <w:jc w:val="both"/>
+        <w:rPr>
+          <w:rFonts w:ascii="Times New Roman" w:hAnsi="Times New Roman" w:cs="Times New Roman"/>
+          <w:color w:val="EE0000"/>
+          <w:sz w:val="24"/>
+          <w:szCs w:val="24"/>
+        </w:rPr>
+      </w:pPr>
+      <w:r>
+        <w:rPr>
+          <w:rFonts w:ascii="Times New Roman" w:hAnsi="Times New Roman" w:cs="Times New Roman"/>
+          <w:color w:val="EE0000"/>
+          <w:sz w:val="24"/>
+          <w:szCs w:val="24"/>
+        </w:rPr>
+        <w:t>AI felhasználása</w:t>
+      </w:r>
+    </w:p>
+    <w:p>
+      <w:pPr>
+        <w:spacing w:line="360" w:lineRule="auto"/>
+        <w:jc w:val="both"/>
+        <w:rPr>
+          <w:rFonts w:ascii="Times New Roman" w:hAnsi="Times New Roman" w:cs="Times New Roman"/>
+          <w:color w:val="EE0000"/>
+          <w:sz w:val="24"/>
+          <w:szCs w:val="24"/>
+        </w:rPr>
+      </w:pPr>
+      <w:r>
+        <w:rPr>
+          <w:rFonts w:ascii="Times New Roman" w:hAnsi="Times New Roman" w:cs="Times New Roman"/>
+          <w:color w:val="EE0000"/>
+          <w:sz w:val="24"/>
+          <w:szCs w:val="24"/>
+        </w:rPr>
+        <w:tab/>
+      </w:r>
+      <w:proofErr w:type="spellStart"/>
+      <w:r>
+        <w:rPr>
+          <w:rFonts w:ascii="Times New Roman" w:hAnsi="Times New Roman" w:cs="Times New Roman"/>
+          <w:color w:val="EE0000"/>
+          <w:sz w:val="24"/>
+          <w:szCs w:val="24"/>
+        </w:rPr>
+        <w:t>Copilot</w:t>
+      </w:r>
+      <w:proofErr w:type="spellEnd"/>
+    </w:p>
+    <w:p>
+      <w:pPr>
+        <w:spacing w:line="360" w:lineRule="auto"/>
+        <w:jc w:val="both"/>
+        <w:rPr>
+          <w:rFonts w:ascii="Times New Roman" w:hAnsi="Times New Roman" w:cs="Times New Roman"/>
+          <w:color w:val="EE0000"/>
+          <w:sz w:val="24"/>
+          <w:szCs w:val="24"/>
+        </w:rPr>
+      </w:pPr>
+      <w:r>
+        <w:rPr>
+          <w:rFonts w:ascii="Times New Roman" w:hAnsi="Times New Roman" w:cs="Times New Roman"/>
+          <w:color w:val="EE0000"/>
+          <w:sz w:val="24"/>
+          <w:szCs w:val="24"/>
+        </w:rPr>
+        <w:tab/>
+      </w:r>
+      <w:proofErr w:type="spellStart"/>
+      <w:r>
+        <w:rPr>
+          <w:rFonts w:ascii="Times New Roman" w:hAnsi="Times New Roman" w:cs="Times New Roman"/>
+          <w:color w:val="EE0000"/>
+          <w:sz w:val="24"/>
+          <w:szCs w:val="24"/>
+        </w:rPr>
+        <w:t>ChatGpt</w:t>
+      </w:r>
+      <w:proofErr w:type="spellEnd"/>
+      <w:r>
+        <w:rPr>
+          <w:rFonts w:ascii="Times New Roman" w:hAnsi="Times New Roman" w:cs="Times New Roman"/>
+          <w:color w:val="EE0000"/>
+          <w:sz w:val="24"/>
+          <w:szCs w:val="24"/>
+        </w:rPr>
+        <w:t>/Claude</w:t>
+      </w:r>
+    </w:p>
+    <w:p>
+      <w:pPr>
+        <w:spacing w:line="360" w:lineRule="auto"/>
+        <w:jc w:val="both"/>
+        <w:rPr>
+          <w:rFonts w:ascii="Times New Roman" w:hAnsi="Times New Roman" w:cs="Times New Roman"/>
+          <w:color w:val="EE0000"/>
+          <w:sz w:val="24"/>
+          <w:szCs w:val="24"/>
+        </w:rPr>
+      </w:pPr>
+      <w:r>
+        <w:rPr>
+          <w:rFonts w:ascii="Times New Roman" w:hAnsi="Times New Roman" w:cs="Times New Roman"/>
+          <w:color w:val="EE0000"/>
+          <w:sz w:val="24"/>
+          <w:szCs w:val="24"/>
+        </w:rPr>
+        <w:tab/>
+      </w:r>
+      <w:r>
+        <w:rPr>
+          <w:rFonts w:ascii="Times New Roman" w:hAnsi="Times New Roman" w:cs="Times New Roman"/>
+          <w:color w:val="EE0000"/>
+          <w:sz w:val="24"/>
+          <w:szCs w:val="24"/>
+        </w:rPr>
+        <w:t xml:space="preserve">AI szerepe a fejlesztési folyamatban és annak </w:t>
+      </w:r>
+      <w:proofErr w:type="spellStart"/>
+      <w:r>
+        <w:rPr>
+          <w:rFonts w:ascii="Times New Roman" w:hAnsi="Times New Roman" w:cs="Times New Roman"/>
+          <w:color w:val="EE0000"/>
+          <w:sz w:val="24"/>
+          <w:szCs w:val="24"/>
+        </w:rPr>
+        <w:t>korlátai</w:t>
+      </w:r>
+      <w:proofErr w:type="spellEnd"/>
+    </w:p>
+    <w:p>
+      <w:pPr>
+        <w:spacing w:line="360" w:lineRule="auto"/>
+        <w:jc w:val="both"/>
+        <w:rPr>
+          <w:rFonts w:ascii="Times New Roman" w:hAnsi="Times New Roman" w:cs="Times New Roman"/>
+          <w:color w:val="EE0000"/>
+          <w:sz w:val="24"/>
+          <w:szCs w:val="24"/>
+        </w:rPr>
+      </w:pPr>
+      <w:r>
+        <w:rPr>
+          <w:rFonts w:ascii="Times New Roman" w:hAnsi="Times New Roman" w:cs="Times New Roman"/>
+          <w:color w:val="EE0000"/>
+          <w:sz w:val="24"/>
+          <w:szCs w:val="24"/>
+        </w:rPr>
+        <w:t>Konklúzió</w:t>
+      </w:r>
+    </w:p>
+    <w:p>
+      <w:pPr>
+        <w:spacing w:line="360" w:lineRule="auto"/>
+        <w:jc w:val="both"/>
+        <w:rPr>
+          <w:rFonts w:ascii="Times New Roman" w:hAnsi="Times New Roman" w:cs="Times New Roman"/>
+          <w:color w:val="EE0000"/>
+          <w:sz w:val="24"/>
+          <w:szCs w:val="24"/>
+        </w:rPr>
+      </w:pPr>
+      <w:r>
+        <w:rPr>
+          <w:rFonts w:ascii="Times New Roman" w:hAnsi="Times New Roman" w:cs="Times New Roman"/>
+          <w:color w:val="EE0000"/>
+          <w:sz w:val="24"/>
+          <w:szCs w:val="24"/>
+        </w:rPr>
+        <w:tab/>
+        <w:t>Mire használják az AI-t ma, milyen területeken lehetne, videójáték világra hatás</w:t>
+      </w:r>
+    </w:p>
+    <w:p>
+      <w:pPr>
+        <w:spacing w:line="360" w:lineRule="auto"/>
+        <w:jc w:val="both"/>
+        <w:rPr>
+          <w:rFonts w:ascii="Times New Roman" w:hAnsi="Times New Roman" w:cs="Times New Roman"/>
+          <w:sz w:val="24"/>
+          <w:szCs w:val="24"/>
+        </w:rPr>
+      </w:pPr>
+      <w:r>
+        <w:rPr>
+          <w:rFonts w:ascii="Times New Roman" w:hAnsi="Times New Roman" w:cs="Times New Roman"/>
+          <w:sz w:val="24"/>
+          <w:szCs w:val="24"/>
+        </w:rPr>
+        <w:tab/>
+        <w:t xml:space="preserve"> </w:t>
+      </w:r>
+    </w:p>
+    <w:p>
+      <w:pPr>
+        <w:rPr>
+          <w:rFonts w:ascii="Times New Roman" w:hAnsi="Times New Roman" w:cs="Times New Roman"/>
+          <w:sz w:val="24"/>
+          <w:szCs w:val="24"/>
+        </w:rPr>
+      </w:pPr>
+      <w:r>
+        <w:rPr>
+          <w:rFonts w:ascii="Times New Roman" w:hAnsi="Times New Roman" w:cs="Times New Roman"/>
+          <w:sz w:val="24"/>
+          <w:szCs w:val="24"/>
+        </w:rPr>
+        <w:br w:type="page"/>
+      </w:r>
+    </w:p>
+    <w:p>
+      <w:pPr>
+        <w:pStyle w:val="SzekdolgozatH1"/>
+        <w:numPr>
+          <w:ilvl w:val="0"/>
+          <w:numId w:val="2"/>
+        </w:numPr>
+        <w:rPr>
           <w:i/>
-          <w:iCs/>
-          <w:sz w:val="28"/>
-          <w:szCs w:val="28"/>
-        </w:rPr>
-      </w:pPr>
-      <w:r>
-        <w:rPr>
-          <w:rFonts w:ascii="Arial" w:hAnsi="Arial" w:cs="Arial"/>
+        </w:rPr>
+      </w:pPr>
+      <w:bookmarkStart w:id="2" w:name="_Toc225005156"/>
+      <w:r>
+        <w:lastRenderedPageBreak/>
+        <w:t>Technológiák</w:t>
+      </w:r>
+      <w:bookmarkEnd w:id="2"/>
+    </w:p>
+    <w:p>
+      <w:pPr>
+        <w:pStyle w:val="Szakdolgozatbekezds"/>
+      </w:pPr>
+      <w:r>
+        <w:t xml:space="preserve">A rendszer megvalósítása során több, egymással együttműködő technológia került felhasználásra. A fejlesztés során fontos szempont volt, hogy az alkalmazás egyes részei jól elkülöníthetőek legyenek, ugyanakkor hatékonyan tudjanak együttműködni. Ennek megfelelően a projekt frontend, backend, valós idejű kommunikációs és tárolási komponensekre bontható, amelyek mind saját technológiai környezetben valósultak meg. </w:t>
+      </w:r>
+    </w:p>
+    <w:p>
+      <w:pPr>
+        <w:pStyle w:val="Szakdolgozath2"/>
+      </w:pPr>
+      <w:bookmarkStart w:id="3" w:name="_Toc225005157"/>
+      <w:r>
+        <w:t xml:space="preserve">Docker és </w:t>
+      </w:r>
+      <w:proofErr w:type="spellStart"/>
+      <w:r>
+        <w:t>konténerizáció</w:t>
+      </w:r>
+      <w:bookmarkEnd w:id="3"/>
+      <w:proofErr w:type="spellEnd"/>
+    </w:p>
+    <w:p>
+      <w:pPr>
+        <w:pStyle w:val="Szakdolgozatbekezds"/>
+      </w:pPr>
+      <w:r>
+        <w:t>A</w:t>
+      </w:r>
+      <w:r>
+        <w:t xml:space="preserve">z </w:t>
+      </w:r>
+      <w:proofErr w:type="spellStart"/>
+      <w:r>
+        <w:t>alkalmazés</w:t>
+      </w:r>
+      <w:proofErr w:type="spellEnd"/>
+      <w:r>
+        <w:t xml:space="preserve"> fejlesztése </w:t>
+      </w:r>
+      <w:proofErr w:type="spellStart"/>
+      <w:r>
+        <w:t>konténerizált</w:t>
+      </w:r>
+      <w:proofErr w:type="spellEnd"/>
+      <w:r>
+        <w:t xml:space="preserve"> környezetben történik Docker segítségével. A különálló szolgáltatások</w:t>
+      </w:r>
+      <w:r>
+        <w:t xml:space="preserve"> </w:t>
+      </w:r>
+      <w:r>
+        <w:t>egymástól elkülönítve,</w:t>
+      </w:r>
+      <w:r>
+        <w:t xml:space="preserve"> de együttesen is elindíthatóak</w:t>
+      </w:r>
+      <w:r>
+        <w:t xml:space="preserve">. A Docker </w:t>
+      </w:r>
+      <w:proofErr w:type="spellStart"/>
+      <w:r>
+        <w:t>Compose</w:t>
+      </w:r>
+      <w:proofErr w:type="spellEnd"/>
+      <w:r>
+        <w:t xml:space="preserve"> használata lehetővé teszi, hogy a teljes fejlesztői környezet egységesen és reprodukálható módon legyen felépíthető</w:t>
+      </w:r>
+      <w:r>
+        <w:t xml:space="preserve">, így szimulálva </w:t>
+      </w:r>
+      <w:proofErr w:type="spellStart"/>
+      <w:r>
+        <w:t>production</w:t>
+      </w:r>
+      <w:proofErr w:type="spellEnd"/>
+      <w:r>
+        <w:t xml:space="preserve"> szerver környezetet</w:t>
+      </w:r>
+      <w:r>
+        <w:t>.</w:t>
+      </w:r>
+    </w:p>
+    <w:p>
+      <w:pPr>
+        <w:pStyle w:val="Szakdolgozath2"/>
+      </w:pPr>
+      <w:bookmarkStart w:id="4" w:name="_Toc225005158"/>
+      <w:r>
+        <w:t>Frontend technológiák</w:t>
+      </w:r>
+      <w:bookmarkEnd w:id="4"/>
+    </w:p>
+    <w:p>
+      <w:pPr>
+        <w:pStyle w:val="Szakdolgozatbekezds"/>
+      </w:pPr>
+      <w:r>
+        <w:t>A kliensoldali alkalmazás webes környezetben működik, és a felhasználói felület, valamint a játéktér megjelenítéséért felel. A frontend fejlesztése során olyan technológiák kerültek kiválasztásra, amelyek támogatják a modern, komponensalapú fejlesztést, valamint az interaktív grafikai megjelenítést.</w:t>
+      </w:r>
+    </w:p>
+    <w:p>
+      <w:pPr>
+        <w:pStyle w:val="Szakdolgozath3"/>
+      </w:pPr>
+      <w:proofErr w:type="spellStart"/>
+      <w:r>
+        <w:t>TypeScript</w:t>
+      </w:r>
+      <w:proofErr w:type="spellEnd"/>
+    </w:p>
+    <w:p>
+      <w:pPr>
+        <w:pStyle w:val="Szakdolgozatbekezds"/>
+      </w:pPr>
+      <w:r>
+        <w:t xml:space="preserve">A frontend fejlesztése </w:t>
+      </w:r>
+      <w:proofErr w:type="spellStart"/>
+      <w:r>
+        <w:t>TypeScript</w:t>
+      </w:r>
+      <w:proofErr w:type="spellEnd"/>
+      <w:r>
+        <w:t xml:space="preserve"> nyelven történt. A </w:t>
+      </w:r>
+      <w:proofErr w:type="spellStart"/>
+      <w:r>
+        <w:t>TypeScript</w:t>
+      </w:r>
+      <w:proofErr w:type="spellEnd"/>
+      <w:r>
+        <w:t xml:space="preserve"> használata lehetővé teszi a statikus típusellenőrzést, amely csökkenti a fejlesztés során előforduló hibák számát, valamint javítja a kód karbantarthatóságát és átláthatóságát</w:t>
+      </w:r>
+      <w:r>
+        <w:t xml:space="preserve"> a </w:t>
+      </w:r>
+      <w:proofErr w:type="spellStart"/>
+      <w:r>
+        <w:t>vanilla</w:t>
+      </w:r>
+      <w:proofErr w:type="spellEnd"/>
+      <w:r>
+        <w:t xml:space="preserve"> </w:t>
+      </w:r>
+      <w:proofErr w:type="spellStart"/>
+      <w:r>
+        <w:t>jsvascripttel</w:t>
+      </w:r>
+      <w:proofErr w:type="spellEnd"/>
+      <w:r>
+        <w:t xml:space="preserve"> szemben</w:t>
+      </w:r>
+      <w:r>
+        <w:t>.</w:t>
+      </w:r>
+    </w:p>
+    <w:p>
+      <w:pPr>
+        <w:pStyle w:val="Szakdolgozath3"/>
+      </w:pPr>
+      <w:proofErr w:type="spellStart"/>
+      <w:r>
+        <w:t>React</w:t>
+      </w:r>
+      <w:proofErr w:type="spellEnd"/>
+    </w:p>
+    <w:p>
+      <w:pPr>
+        <w:pStyle w:val="Szakdolgozatbekezds"/>
+      </w:pPr>
+      <w:r>
+        <w:t>A</w:t>
+      </w:r>
+      <w:r>
+        <w:t xml:space="preserve"> webes kliens oldal</w:t>
+      </w:r>
+      <w:r>
+        <w:t xml:space="preserve"> kialakítása </w:t>
+      </w:r>
+      <w:proofErr w:type="spellStart"/>
+      <w:r>
+        <w:t>React</w:t>
+      </w:r>
+      <w:proofErr w:type="spellEnd"/>
+      <w:r>
+        <w:t xml:space="preserve"> könyvtár segítségével valósult meg</w:t>
+      </w:r>
+      <w:r>
+        <w:t>, amelyet eredetileg a Facebook, ma</w:t>
+      </w:r>
+      <w:r>
+        <w:t xml:space="preserve">i nevén </w:t>
+      </w:r>
+      <w:proofErr w:type="spellStart"/>
+      <w:r>
+        <w:t>Meta</w:t>
+      </w:r>
+      <w:proofErr w:type="spellEnd"/>
+      <w:r>
+        <w:t xml:space="preserve"> fejlesztett</w:t>
+      </w:r>
+      <w:r>
+        <w:t xml:space="preserve">. </w:t>
+      </w:r>
+      <w:r>
+        <w:t>Elsődleges célja az interaktív, dinamikusan frissülő felületek hatékony kezelése.</w:t>
+      </w:r>
+      <w:r>
+        <w:t xml:space="preserve"> L</w:t>
+      </w:r>
+      <w:r>
+        <w:t>egnagyobb előnye a komponensalapú szemlélet. Ennek köszönhetően a felhasználói felület kisebb, jól elkülöníthető és újra</w:t>
+      </w:r>
+      <w:r>
+        <w:t xml:space="preserve"> </w:t>
+      </w:r>
+      <w:r>
+        <w:t xml:space="preserve">felhasználható elemekre bontható, ami jelentősen javítja a kód átláthatóságát, </w:t>
+      </w:r>
+      <w:r>
+        <w:lastRenderedPageBreak/>
+        <w:t>karbantarthatóságát</w:t>
+      </w:r>
+      <w:r>
+        <w:t xml:space="preserve">. </w:t>
+      </w:r>
+      <w:r>
+        <w:t xml:space="preserve">Alternatív megoldásként szóba jöhetett volna például az </w:t>
+      </w:r>
+      <w:proofErr w:type="spellStart"/>
+      <w:r>
+        <w:t>Angular</w:t>
+      </w:r>
+      <w:proofErr w:type="spellEnd"/>
+      <w:r>
+        <w:t xml:space="preserve"> vagy</w:t>
+      </w:r>
+      <w:r>
+        <w:t xml:space="preserve"> a Vue.js</w:t>
+      </w:r>
+      <w:r>
+        <w:t>, azonban személyes szubjektív preferencia alapján erre esett a választás.</w:t>
+      </w:r>
+    </w:p>
+    <w:p>
+      <w:pPr>
+        <w:pStyle w:val="Szakdolgozath3"/>
+      </w:pPr>
+      <w:proofErr w:type="spellStart"/>
+      <w:r>
+        <w:t>PixiJS</w:t>
+      </w:r>
+      <w:proofErr w:type="spellEnd"/>
+    </w:p>
+    <w:p>
+      <w:pPr>
+        <w:pStyle w:val="Szakdolgozatbekezds"/>
+        <w:rPr>
           <w:b/>
-          <w:bCs/>
-          <w:i/>
-          <w:iCs/>
-          <w:sz w:val="28"/>
-          <w:szCs w:val="28"/>
-        </w:rPr>
+        </w:rPr>
+      </w:pPr>
+      <w:r>
+        <w:t xml:space="preserve">A játéktér megjelenítéséhez a </w:t>
+      </w:r>
+      <w:proofErr w:type="spellStart"/>
+      <w:r>
+        <w:t>PixiJS</w:t>
+      </w:r>
+      <w:proofErr w:type="spellEnd"/>
+      <w:r>
+        <w:t xml:space="preserve"> grafikai könyvtár került felhasználásra. A </w:t>
+      </w:r>
+      <w:proofErr w:type="spellStart"/>
+      <w:r>
+        <w:t>PixiJS</w:t>
+      </w:r>
+      <w:proofErr w:type="spellEnd"/>
+      <w:r>
+        <w:t xml:space="preserve"> böngészőben futó, elsősorban HTML5 </w:t>
+      </w:r>
+      <w:proofErr w:type="spellStart"/>
+      <w:r>
+        <w:t>Canvas</w:t>
+      </w:r>
+      <w:proofErr w:type="spellEnd"/>
+      <w:r>
+        <w:t xml:space="preserve"> és </w:t>
+      </w:r>
+      <w:proofErr w:type="spellStart"/>
+      <w:r>
+        <w:t>WebGL</w:t>
+      </w:r>
+      <w:proofErr w:type="spellEnd"/>
+      <w:r>
+        <w:t xml:space="preserve"> alapú 2D </w:t>
+      </w:r>
+      <w:proofErr w:type="spellStart"/>
+      <w:r>
+        <w:t>renderelést</w:t>
+      </w:r>
+      <w:proofErr w:type="spellEnd"/>
+      <w:r>
+        <w:t xml:space="preserve"> biztosító technológia, amely alkalmas játékobjektumok, helyszínek és interaktív elemek dinamikus megjelenítésére és kezelésére.</w:t>
+      </w:r>
+    </w:p>
+    <w:p>
+      <w:pPr>
+        <w:pStyle w:val="Szakdolgozath3"/>
+      </w:pPr>
+      <w:r>
+        <w:t>Socket.IO kliens</w:t>
+      </w:r>
+    </w:p>
+    <w:p>
+      <w:pPr>
+        <w:pStyle w:val="Szakdolgozatbekezds"/>
+      </w:pPr>
+      <w:r>
+        <w:t>A Socket.IO egy széles körben használt, nyílt forráskódú valós idejű kommunikációs könyvtár, amelyet a fejlesztői közösség aktívan karbantart.</w:t>
+      </w:r>
+      <w:r>
+        <w:t xml:space="preserve"> </w:t>
+      </w:r>
+      <w:r>
+        <w:t>Ennek szerepe a kliens valós időben való megjelenítése a háttérben futó folyamatok állapotáról</w:t>
+      </w:r>
+      <w:r>
+        <w:t>, mint például egy új pálya generálása.</w:t>
+      </w:r>
+    </w:p>
+    <w:p>
+      <w:pPr>
+        <w:pStyle w:val="Szakdolgozath2"/>
+      </w:pPr>
+      <w:bookmarkStart w:id="5" w:name="_Toc225005159"/>
+      <w:r>
+        <w:t>Backend technológiák</w:t>
+      </w:r>
+      <w:bookmarkEnd w:id="5"/>
+    </w:p>
+    <w:p>
+      <w:pPr>
+        <w:pStyle w:val="Szakdolgozatbekezds"/>
+      </w:pPr>
+      <w:r>
+        <w:t>A szerveroldali logika, az üzleti folyamatok kezelése, az AI integráció, valamint az adatbázis-műveletek a backend rétegben valósulnak meg. A backend fejlesztése során a gyors fejlesztést, a jó strukturálhatóságot és az API-központú működést támogató technológiák kerültek kiválasztásra.</w:t>
+      </w:r>
+    </w:p>
+    <w:p>
+      <w:pPr>
+        <w:pStyle w:val="Szakdolgozath3"/>
+      </w:pPr>
+      <w:r>
+        <w:t>Python</w:t>
+      </w:r>
+    </w:p>
+    <w:p>
+      <w:pPr>
+        <w:pStyle w:val="Szakdolgozatbekezds"/>
+      </w:pPr>
+      <w:r>
+        <w:t>A backend Python nyelven készült. A Python előnye, hogy jól használható webes szolgáltatások, adatkezelési logikák és mesterséges intelligenciához kapcsolódó integrációk megvalósítására.</w:t>
+      </w:r>
+      <w:r>
+        <w:t xml:space="preserve"> Projekt elején tervben voltak kép transzformációs feladatok is, ezek valósultak volna meg az </w:t>
+      </w:r>
+      <w:proofErr w:type="spellStart"/>
+      <w:r>
+        <w:t>OpenCV</w:t>
+      </w:r>
+      <w:proofErr w:type="spellEnd"/>
+      <w:r>
+        <w:t xml:space="preserve"> könyvtár segítségével, azonban az idő előre haladtával nem volt szükség ezekre a fejlesztésekre.</w:t>
+      </w:r>
+    </w:p>
+    <w:p>
+      <w:pPr>
+        <w:pStyle w:val="Szakdolgozath3"/>
+      </w:pPr>
+      <w:proofErr w:type="spellStart"/>
+      <w:r>
+        <w:t>FastAPI</w:t>
+      </w:r>
+      <w:proofErr w:type="spellEnd"/>
+      <w:r>
+        <w:t xml:space="preserve"> és </w:t>
+      </w:r>
+      <w:proofErr w:type="spellStart"/>
+      <w:r>
+        <w:t>OpenAPI</w:t>
+      </w:r>
+      <w:proofErr w:type="spellEnd"/>
+    </w:p>
+    <w:p>
+      <w:pPr>
+        <w:pStyle w:val="Szakdolgozatbekezds"/>
+      </w:pPr>
+      <w:r>
+        <w:t xml:space="preserve">A backend A </w:t>
+      </w:r>
+      <w:proofErr w:type="spellStart"/>
+      <w:r>
+        <w:t>a</w:t>
+      </w:r>
+      <w:proofErr w:type="spellEnd"/>
+      <w:r>
+        <w:t xml:space="preserve"> </w:t>
+      </w:r>
+      <w:proofErr w:type="spellStart"/>
+      <w:r>
+        <w:t>FastAPI</w:t>
+      </w:r>
+      <w:proofErr w:type="spellEnd"/>
+      <w:r>
+        <w:t xml:space="preserve"> keretrendszerre épül. A </w:t>
+      </w:r>
+      <w:proofErr w:type="spellStart"/>
+      <w:r>
+        <w:t>FastAPI</w:t>
+      </w:r>
+      <w:proofErr w:type="spellEnd"/>
+      <w:r>
+        <w:t xml:space="preserve"> modern, nagy teljesítményű megoldást nyújt REST alapú szolgáltatások fejlesztésére, és automatikusan képes </w:t>
+      </w:r>
+      <w:proofErr w:type="spellStart"/>
+      <w:r>
+        <w:t>OpenAPI</w:t>
+      </w:r>
+      <w:proofErr w:type="spellEnd"/>
+      <w:r>
+        <w:t xml:space="preserve"> specifikáció generálására a definiált útvonalak, sémák és típusannotációk alapján. Ez </w:t>
+      </w:r>
+      <w:r>
         <w:lastRenderedPageBreak/>
-        <w:t>Feladatkiírás</w:t>
-      </w:r>
-    </w:p>
-    <w:p>
-      <w:pPr>
-        <w:rPr>
-          <w:rFonts w:ascii="Times New Roman" w:hAnsi="Times New Roman" w:cs="Times New Roman"/>
-          <w:sz w:val="28"/>
-          <w:szCs w:val="28"/>
-        </w:rPr>
-      </w:pPr>
-      <w:r>
-        <w:rPr>
-          <w:rFonts w:ascii="Times New Roman" w:hAnsi="Times New Roman" w:cs="Times New Roman"/>
-          <w:sz w:val="28"/>
-          <w:szCs w:val="28"/>
-        </w:rPr>
-        <w:t>Feladatom egy webes keretbe foglalt szabaduló szoba játék megírása volt, melynek a pályát leíró adat struktúráját és a játékban dinamikusan változó játékelemek grafikai megjelenését a mesterséges intelligencia generálja.</w:t>
-      </w:r>
-    </w:p>
-    <w:p>
-      <w:pPr>
-        <w:rPr>
-          <w:rFonts w:ascii="Times New Roman" w:hAnsi="Times New Roman" w:cs="Times New Roman"/>
-          <w:sz w:val="28"/>
-          <w:szCs w:val="28"/>
-        </w:rPr>
-      </w:pPr>
-      <w:r>
-        <w:rPr>
-          <w:rFonts w:ascii="Times New Roman" w:hAnsi="Times New Roman" w:cs="Times New Roman"/>
-          <w:sz w:val="28"/>
-          <w:szCs w:val="28"/>
-        </w:rPr>
-        <w:tab/>
-      </w:r>
-      <w:r>
-        <w:rPr>
-          <w:rFonts w:ascii="Times New Roman" w:hAnsi="Times New Roman" w:cs="Times New Roman"/>
-          <w:sz w:val="28"/>
-          <w:szCs w:val="28"/>
-        </w:rPr>
-        <w:t>Itt lehetne most mesélni nagyvonalakban az alkalmazásról mint a játék részéről meg a webes körítésről</w:t>
-      </w:r>
-    </w:p>
-    <w:p>
-      <w:pPr>
-        <w:rPr>
-          <w:rFonts w:ascii="Times New Roman" w:hAnsi="Times New Roman" w:cs="Times New Roman"/>
-          <w:color w:val="EE0000"/>
-          <w:sz w:val="28"/>
-          <w:szCs w:val="28"/>
-        </w:rPr>
-      </w:pPr>
-      <w:r>
-        <w:rPr>
-          <w:rFonts w:ascii="Times New Roman" w:hAnsi="Times New Roman" w:cs="Times New Roman"/>
-          <w:color w:val="EE0000"/>
-          <w:sz w:val="28"/>
-          <w:szCs w:val="28"/>
-        </w:rPr>
-        <w:t>TODO: Sorközök beállítása meg a header után sor távolság</w:t>
-      </w:r>
+        <w:t xml:space="preserve">megkönnyíti az API dokumentálását és az interfészek áttekinthetőségét. A választás azért esett erre a keretrendszerre, mert a </w:t>
+      </w:r>
+      <w:proofErr w:type="spellStart"/>
+      <w:r>
+        <w:t>Flaskkal</w:t>
+      </w:r>
+      <w:proofErr w:type="spellEnd"/>
+      <w:r>
+        <w:t xml:space="preserve"> szemben erősebben épít a típusosságra, ami biztonságosabb és átláthatóbb API-fejlesztést tesz lehetővé.</w:t>
+      </w:r>
+    </w:p>
+    <w:p>
+      <w:pPr>
+        <w:pStyle w:val="Szakdolgozath3"/>
+      </w:pPr>
+      <w:proofErr w:type="spellStart"/>
+      <w:r>
+        <w:t>SQLAlchemy</w:t>
+      </w:r>
+      <w:proofErr w:type="spellEnd"/>
+      <w:r>
+        <w:t xml:space="preserve"> és </w:t>
+      </w:r>
+      <w:proofErr w:type="spellStart"/>
+      <w:r>
+        <w:t>Alembic</w:t>
+      </w:r>
+      <w:proofErr w:type="spellEnd"/>
+    </w:p>
+    <w:p>
+      <w:pPr>
+        <w:pStyle w:val="Szakdolgozatbekezds"/>
+      </w:pPr>
+      <w:r>
+        <w:t xml:space="preserve">Az adatbázisréteg kezelésére a </w:t>
+      </w:r>
+      <w:proofErr w:type="spellStart"/>
+      <w:r>
+        <w:t>SQLAlchemy</w:t>
+      </w:r>
+      <w:proofErr w:type="spellEnd"/>
+      <w:r>
+        <w:t xml:space="preserve"> ORM (</w:t>
+      </w:r>
+      <w:proofErr w:type="spellStart"/>
+      <w:r>
+        <w:t>Object-Relational</w:t>
+      </w:r>
+      <w:proofErr w:type="spellEnd"/>
+      <w:r>
+        <w:t xml:space="preserve"> </w:t>
+      </w:r>
+      <w:proofErr w:type="spellStart"/>
+      <w:r>
+        <w:t>Mapping</w:t>
+      </w:r>
+      <w:proofErr w:type="spellEnd"/>
+      <w:r>
+        <w:t>) került alkalmazásra, amely lehetővé teszi a relációs adatmodell objektumorientált kezelését. Ennek köszönhetően az adatbázissal való kommunikáció során nem minden esetben szükséges alacsony szintű SQL utasítások közvetlen írása, mivel az adatszerkezetek Python objektumokon keresztül is kezelhetők. Ez átláthatóbbá és karbantarthatóbbá teszi a backend oldali adatkezelési logikát.</w:t>
+      </w:r>
+    </w:p>
+    <w:p>
+      <w:pPr>
+        <w:pStyle w:val="Szakdolgozatbekezds"/>
+      </w:pPr>
+      <w:r>
+        <w:t xml:space="preserve">Az adatbázisséma változásainak nyomon követésére és a migrációk kezelésére az </w:t>
+      </w:r>
+      <w:proofErr w:type="spellStart"/>
+      <w:r>
+        <w:t>Alembic</w:t>
+      </w:r>
+      <w:proofErr w:type="spellEnd"/>
+      <w:r>
+        <w:t xml:space="preserve"> került felhasználásra. Az </w:t>
+      </w:r>
+      <w:proofErr w:type="spellStart"/>
+      <w:r>
+        <w:t>Alembic</w:t>
+      </w:r>
+      <w:proofErr w:type="spellEnd"/>
+      <w:r>
+        <w:t xml:space="preserve"> a háttérben SQL műveleteket hajt végre, ugyanakkor strukturált és verziókövethető formában támogatja az adatbázis sémafejlődésének kezelését. Ez különösen hasznos a projekt folyamatos fejlesztése során, amikor az entitások és kapcsolatok idővel módosulhatnak.</w:t>
+      </w:r>
+    </w:p>
+    <w:p>
+      <w:pPr>
+        <w:pStyle w:val="Szakdolgozath3"/>
+      </w:pPr>
+      <w:r>
+        <w:t>JWT alapú autentikáció</w:t>
+      </w:r>
+    </w:p>
+    <w:p>
+      <w:pPr>
+        <w:pStyle w:val="Szakdolgozatbekezds"/>
+      </w:pPr>
+      <w:r>
+        <w:t xml:space="preserve">A felhasználók hitelesítése JSON Web </w:t>
+      </w:r>
+      <w:proofErr w:type="spellStart"/>
+      <w:r>
+        <w:t>Token</w:t>
+      </w:r>
+      <w:proofErr w:type="spellEnd"/>
+      <w:r>
+        <w:t xml:space="preserve"> (JWT) alapú megoldással történik, amely RS256 algoritmust alkalmazó, nyilvános és privát kulcspáron alapuló aláírással került megvalósításra. Ez biztosítja, hogy a kliensoldali alkalmazás a bejelentkezést követően biztonságos módon férjen hozzá a védett erőforrásokhoz, miközben a szerver ellenőrizni tudja a </w:t>
+      </w:r>
+      <w:proofErr w:type="spellStart"/>
+      <w:r>
+        <w:t>tokenek</w:t>
+      </w:r>
+      <w:proofErr w:type="spellEnd"/>
+      <w:r>
+        <w:t xml:space="preserve"> hitelességét és érvényességét.</w:t>
+      </w:r>
+    </w:p>
+    <w:p>
+      <w:pPr>
+        <w:pStyle w:val="Szakdolgozatbekezds"/>
+      </w:pPr>
+      <w:r>
+        <w:t>Egy fontos pontosítás: itt nem igazán </w:t>
+      </w:r>
+      <w:proofErr w:type="spellStart"/>
+      <w:r>
+        <w:t>async</w:t>
+      </w:r>
+      <w:proofErr w:type="spellEnd"/>
+      <w:r>
+        <w:t xml:space="preserve"> titkosításról van szó, hanem aszimmetrikus kulcsú aláírásról. Ha akarod, ezt még tudom kicsit egyszerűbb vagy kicsit akadémikusabb stílusra is húzni.</w:t>
+      </w:r>
+    </w:p>
+    <w:p>
+      <w:pPr>
+        <w:pStyle w:val="Szakdolgozath2"/>
+      </w:pPr>
+      <w:bookmarkStart w:id="6" w:name="_Toc225005160"/>
+      <w:r>
+        <w:t>Valós idejű kommunikáció</w:t>
+      </w:r>
+      <w:bookmarkEnd w:id="6"/>
+    </w:p>
+    <w:p>
+      <w:pPr>
+        <w:pStyle w:val="Szakdolgozatbekezds"/>
+      </w:pPr>
+      <w:r>
+        <w:t>A rendszer egyes folyamatai, különösen a hosszabb ideig tartó pályagenerálás, valós idejű visszajelzést igényelnek. Ennek megvalósítására külön kommunikációs szerver került kialakításra.</w:t>
+      </w:r>
+    </w:p>
+    <w:p>
+      <w:pPr>
+        <w:pStyle w:val="Szakdolgozath3"/>
+      </w:pPr>
+      <w:proofErr w:type="spellStart"/>
+      <w:r>
+        <w:lastRenderedPageBreak/>
+        <w:t>Node.js</w:t>
+      </w:r>
+      <w:proofErr w:type="spellEnd"/>
+    </w:p>
+    <w:p>
+      <w:pPr>
+        <w:pStyle w:val="Szakdolgozatbekezds"/>
+      </w:pPr>
+      <w:r>
+        <w:t>A valós idejű kommunikációs réteg Node.js környezetben fut. A Node.js egy JavaScript futtatókörnyezet, amelyet a Chrome V8 motorjára építettek, és amely különösen jól használható hálózati</w:t>
+      </w:r>
+      <w:r>
+        <w:t xml:space="preserve"> és</w:t>
+      </w:r>
+      <w:r>
+        <w:t xml:space="preserve"> </w:t>
+      </w:r>
+      <w:proofErr w:type="spellStart"/>
+      <w:r>
+        <w:t>eseményvezérelt</w:t>
+      </w:r>
+      <w:proofErr w:type="spellEnd"/>
+      <w:r>
+        <w:t xml:space="preserve"> alkalmazások fejlesztésére. Működésének egyik legfontosabb jellemzője a nem blokkoló I/O-kezelés, amely lehetővé teszi, hogy a szerver egyszerre több klienskapcsolatot is hatékonyan kezeljen anélkül, hogy minden kérés külön végrehajtási szálat igényelne.</w:t>
+      </w:r>
+    </w:p>
+    <w:p>
+      <w:pPr>
+        <w:pStyle w:val="Szakdolgozath3"/>
+      </w:pPr>
+      <w:r>
+        <w:t>Express</w:t>
+      </w:r>
+    </w:p>
+    <w:p>
+      <w:pPr>
+        <w:pStyle w:val="Szakdolgozatbekezds"/>
+      </w:pPr>
+      <w:r>
+        <w:t xml:space="preserve">A </w:t>
+      </w:r>
+      <w:proofErr w:type="spellStart"/>
+      <w:r>
+        <w:t>websocket</w:t>
+      </w:r>
+      <w:proofErr w:type="spellEnd"/>
+      <w:r>
+        <w:t xml:space="preserve"> szerver HTTP végpontjainak és alapvető kiszolgálási logikájának megvalósítására az Express keretrendszer került felhasználásra. Az Express egyszerű és könnyen bővíthető megoldást nyújt a szerveroldali kommunikációs réteg számára.</w:t>
+      </w:r>
+    </w:p>
+    <w:p>
+      <w:pPr>
+        <w:pStyle w:val="Szakdolgozath3"/>
+      </w:pPr>
+      <w:r>
+        <w:t>Socket.IO</w:t>
+      </w:r>
+    </w:p>
+    <w:p>
+      <w:pPr>
+        <w:pStyle w:val="Szakdolgozatbekezds"/>
+      </w:pPr>
+      <w:r>
+        <w:t>A szerver és a kliens közötti valós idejű eseményalapú kommunikációt a Socket.IO biztosítja. Ennek segítségével a frontend folyamatos tájékoztatást kaphat például a pályagenerálás aktuális állapotáról.</w:t>
+      </w:r>
+    </w:p>
+    <w:p>
+      <w:pPr>
+        <w:pStyle w:val="Szakdolgozath2"/>
+      </w:pPr>
+      <w:bookmarkStart w:id="7" w:name="_Toc225005161"/>
+      <w:r>
+        <w:t>Adatkezelés és tárolás</w:t>
+      </w:r>
+      <w:bookmarkEnd w:id="7"/>
+    </w:p>
+    <w:p>
+      <w:pPr>
+        <w:pStyle w:val="Szakdolgozatbekezds"/>
+      </w:pPr>
+      <w:r>
+        <w:t>A rendszer működése során egyszerre szükséges strukturált adatok és fájlalapú erőforrások tárolása. Ennek megfelelően külön technológiák szolgálnak a relációs adatok és a generált állományok kezelésére.</w:t>
+      </w:r>
+    </w:p>
+    <w:p>
+      <w:pPr>
+        <w:pStyle w:val="Szakdolgozath3"/>
+      </w:pPr>
+      <w:proofErr w:type="spellStart"/>
+      <w:r>
+        <w:t>PostgreSQL</w:t>
+      </w:r>
+      <w:proofErr w:type="spellEnd"/>
+    </w:p>
+    <w:p>
+      <w:pPr>
+        <w:pStyle w:val="Szakdolgozatbekezds"/>
+      </w:pPr>
+      <w:r>
+        <w:t xml:space="preserve">A strukturált adatok tárolására </w:t>
+      </w:r>
+      <w:proofErr w:type="spellStart"/>
+      <w:r>
+        <w:t>PostgreSQL</w:t>
+      </w:r>
+      <w:proofErr w:type="spellEnd"/>
+      <w:r>
+        <w:t xml:space="preserve"> adatbázis-kezelő rendszer szolgál. Ebben kerülnek eltárolásra például a felhasználói adatok, a </w:t>
+      </w:r>
+      <w:proofErr w:type="spellStart"/>
+      <w:r>
+        <w:t>tokenekhez</w:t>
+      </w:r>
+      <w:proofErr w:type="spellEnd"/>
+      <w:r>
+        <w:t xml:space="preserve"> kapcsolódó információk, valamint a pályákhoz tartozó metaadatok és statisztikák.</w:t>
+      </w:r>
+    </w:p>
+    <w:p>
+      <w:pPr>
+        <w:pStyle w:val="Szakdolgozath3"/>
+      </w:pPr>
+      <w:proofErr w:type="spellStart"/>
+      <w:r>
+        <w:t>MinIO</w:t>
+      </w:r>
+      <w:proofErr w:type="spellEnd"/>
+    </w:p>
+    <w:p>
+      <w:pPr>
+        <w:pStyle w:val="Szakdolgozatbekezds"/>
+      </w:pPr>
+      <w:r>
+        <w:t xml:space="preserve">A generált fájlok, például a pályákhoz tartozó JSON állományok és képi erőforrások tárolására </w:t>
+      </w:r>
+      <w:proofErr w:type="spellStart"/>
+      <w:r>
+        <w:t>MinIO</w:t>
+      </w:r>
+      <w:proofErr w:type="spellEnd"/>
+      <w:r>
+        <w:t xml:space="preserve"> objektumtároló került alkalmazásra. A </w:t>
+      </w:r>
+      <w:proofErr w:type="spellStart"/>
+      <w:r>
+        <w:t>MinIO</w:t>
+      </w:r>
+      <w:proofErr w:type="spellEnd"/>
+      <w:r>
+        <w:t xml:space="preserve"> egy S3-kompatibilis objektumtárolási megoldás, amely működésében az Amazon Web </w:t>
+      </w:r>
+      <w:proofErr w:type="spellStart"/>
+      <w:r>
+        <w:t>Services</w:t>
+      </w:r>
+      <w:proofErr w:type="spellEnd"/>
+      <w:r>
+        <w:t xml:space="preserve"> </w:t>
+      </w:r>
+      <w:r>
+        <w:lastRenderedPageBreak/>
+        <w:t>társzolgáltatásaihoz hasonló módon használható. Ez lehetővé teszi, hogy a fájlok kezelése elkülönüljön a relációs adatbázistól, így a strukturált adatok és a bináris állományok tárolása külön rétegben valósulhat meg.</w:t>
+      </w:r>
+    </w:p>
+    <w:p>
+      <w:pPr>
+        <w:pStyle w:val="Szakdolgozath2"/>
+      </w:pPr>
+      <w:bookmarkStart w:id="8" w:name="_Toc225005162"/>
+      <w:r>
+        <w:t>MI integráció</w:t>
+      </w:r>
+      <w:bookmarkEnd w:id="8"/>
+    </w:p>
+    <w:p>
+      <w:pPr>
+        <w:pStyle w:val="Szakdolgozatbekezds"/>
+      </w:pPr>
+      <w:r>
+        <w:t>A rendszer egyik legfontosabb sajátossága, hogy a pályagenerálás és bizonyos erőforrások előállítása mesterséges intelligencia segítségével történik. Ez a projekt központi innovatív eleme, ezért külön technológiai kategóriaként is indokolt kezelni.</w:t>
+      </w:r>
+    </w:p>
+    <w:p>
+      <w:pPr>
+        <w:pStyle w:val="Szakdolgozath3"/>
+      </w:pPr>
+      <w:proofErr w:type="spellStart"/>
+      <w:r>
+        <w:t>OpenAI</w:t>
+      </w:r>
+      <w:proofErr w:type="spellEnd"/>
+      <w:r>
+        <w:t xml:space="preserve"> API</w:t>
+      </w:r>
+    </w:p>
+    <w:p>
+      <w:pPr>
+        <w:pStyle w:val="Szakdolgozatbekezds"/>
+      </w:pPr>
+      <w:r>
+        <w:t xml:space="preserve">A mesterséges intelligencia alapú funkciók megvalósítása az </w:t>
+      </w:r>
+      <w:proofErr w:type="spellStart"/>
+      <w:r>
+        <w:t>OpenAI</w:t>
+      </w:r>
+      <w:proofErr w:type="spellEnd"/>
+      <w:r>
+        <w:t xml:space="preserve"> API integrációjával történt. A rendszer ezt használja a pályák generálásához, valamint egyes grafikai elemek előállításához is. Az AI szolgáltatás backend oldali integrációja lehetővé teszi, hogy a generálási folyamat szervesen kapcsolódjon az alkalmazás többi komponenséhez.</w:t>
+      </w:r>
+    </w:p>
+    <w:p>
+      <w:pPr>
+        <w:pStyle w:val="Szakdolgozatbekezds"/>
+      </w:pPr>
+    </w:p>
+    <w:p>
+      <w:pPr>
+        <w:spacing w:line="360" w:lineRule="auto"/>
+        <w:jc w:val="both"/>
+        <w:rPr>
+          <w:rFonts w:ascii="Times New Roman" w:hAnsi="Times New Roman" w:cs="Times New Roman"/>
+          <w:sz w:val="24"/>
+          <w:szCs w:val="24"/>
+        </w:rPr>
+      </w:pPr>
     </w:p>
     <w:sectPr>
-      <w:footerReference w:type="default" r:id="rId6"/>
+      <w:footerReference w:type="default" r:id="rId7"/>
       <w:pgSz w:w="12240" w:h="15840" w:code="1"/>
       <w:pgMar w:top="1418" w:right="1418" w:bottom="1418" w:left="1418" w:header="720" w:footer="720" w:gutter="567"/>
       <w:pgNumType w:start="2"/>
@@ -654,11 +3470,6 @@
         <w:docPartUnique/>
       </w:docPartObj>
     </w:sdtPr>
-    <w:sdtEndPr>
-      <w:rPr>
-        <w:noProof/>
-      </w:rPr>
-    </w:sdtEndPr>
     <w:sdtContent>
       <w:p>
         <w:pPr>
@@ -675,15 +3486,9 @@
           <w:fldChar w:fldCharType="separate"/>
         </w:r>
         <w:r>
-          <w:rPr>
-            <w:noProof/>
-          </w:rPr>
           <w:t>2</w:t>
         </w:r>
         <w:r>
-          <w:rPr>
-            <w:noProof/>
-          </w:rPr>
           <w:fldChar w:fldCharType="end"/>
         </w:r>
       </w:p>
@@ -714,6 +3519,249 @@
     </w:p>
   </w:footnote>
 </w:footnotes>
+</file>
+
+<file path=word/numbering.xml><?xml version="1.0" encoding="utf-8"?>
+<w:numbering xmlns:wpc="http://schemas.microsoft.com/office/word/2010/wordprocessingCanvas" xmlns:cx="http://schemas.microsoft.com/office/drawing/2014/chartex" xmlns:cx1="http://schemas.microsoft.com/office/drawing/2015/9/8/chartex" xmlns:cx2="http://schemas.microsoft.com/office/drawing/2015/10/21/chartex" xmlns:cx3="http://schemas.microsoft.com/office/drawing/2016/5/9/chartex" xmlns:cx4="http://schemas.microsoft.com/office/drawing/2016/5/10/chartex" xmlns:cx5="http://schemas.microsoft.com/office/drawing/2016/5/11/chartex" xmlns:cx6="http://schemas.microsoft.com/office/drawing/2016/5/12/chartex" xmlns:cx7="http://schemas.microsoft.com/office/drawing/2016/5/13/chartex" xmlns:cx8="http://schemas.microsoft.com/office/drawing/2016/5/14/chartex" xmlns:mc="http://schemas.openxmlformats.org/markup-compatibility/2006" xmlns:aink="http://schemas.microsoft.com/office/drawing/2016/ink" xmlns:am3d="http://schemas.microsoft.com/office/drawing/2017/model3d" xmlns:o="urn:schemas-microsoft-com:office:office" xmlns:oel="http://schemas.microsoft.com/office/2019/extlst" xmlns:r="http://schemas.openxmlformats.org/officeDocument/2006/relationships" xmlns:m="http://schemas.openxmlformats.org/officeDocument/2006/math" xmlns:v="urn:schemas-microsoft-com:vml" xmlns:wp14="http://schemas.microsoft.com/office/word/2010/wordprocessingDrawing" xmlns:wp="http://schemas.openxmlformats.org/drawingml/2006/wordprocessingDrawing" xmlns:w10="urn:schemas-microsoft-com:office:word" xmlns:w="http://schemas.openxmlformats.org/wordprocessingml/2006/main" xmlns:w14="http://schemas.microsoft.com/office/word/2010/wordml" xmlns:w15="http://schemas.microsoft.com/office/word/2012/wordml" xmlns:w16cex="http://schemas.microsoft.com/office/word/2018/wordml/cex" xmlns:w16cid="http://schemas.microsoft.com/office/word/2016/wordml/cid" xmlns:w16="http://schemas.microsoft.com/office/word/2018/wordml" xmlns:w16du="http://schemas.microsoft.com/office/word/2023/wordml/word16du" xmlns:w16sdtdh="http://schemas.microsoft.com/office/word/2020/wordml/sdtdatahash" xmlns:w16sdtfl="http://schemas.microsoft.com/office/word/2024/wordml/sdtformatlock" xmlns:w16se="http://schemas.microsoft.com/office/word/2015/wordml/symex" xmlns:wpg="http://schemas.microsoft.com/office/word/2010/wordprocessingGroup" xmlns:wpi="http://schemas.microsoft.com/office/word/2010/wordprocessingInk" xmlns:wne="http://schemas.microsoft.com/office/word/2006/wordml" xmlns:wps="http://schemas.microsoft.com/office/word/2010/wordprocessingShape" mc:Ignorable="w14 w15 w16se w16cid w16 w16cex w16sdtdh w16sdtfl w16du wp14">
+  <w:abstractNum w:abstractNumId="0" w15:restartNumberingAfterBreak="0">
+    <w:nsid w:val="00654749"/>
+    <w:multiLevelType w:val="multilevel"/>
+    <w:tmpl w:val="0BAE8CE8"/>
+    <w:lvl w:ilvl="0">
+      <w:start w:val="1"/>
+      <w:numFmt w:val="decimal"/>
+      <w:lvlText w:val="%1."/>
+      <w:lvlJc w:val="left"/>
+      <w:pPr>
+        <w:ind w:left="360" w:hanging="360"/>
+      </w:pPr>
+      <w:rPr>
+        <w:rFonts w:hint="default"/>
+      </w:rPr>
+    </w:lvl>
+    <w:lvl w:ilvl="1">
+      <w:start w:val="1"/>
+      <w:numFmt w:val="decimal"/>
+      <w:lvlText w:val="%1.%2."/>
+      <w:lvlJc w:val="left"/>
+      <w:pPr>
+        <w:ind w:left="792" w:hanging="432"/>
+      </w:pPr>
+      <w:rPr>
+        <w:rFonts w:hint="default"/>
+      </w:rPr>
+    </w:lvl>
+    <w:lvl w:ilvl="2">
+      <w:start w:val="1"/>
+      <w:numFmt w:val="decimal"/>
+      <w:lvlText w:val="%1.%2.%3."/>
+      <w:lvlJc w:val="left"/>
+      <w:pPr>
+        <w:ind w:left="1224" w:hanging="504"/>
+      </w:pPr>
+      <w:rPr>
+        <w:rFonts w:hint="default"/>
+      </w:rPr>
+    </w:lvl>
+    <w:lvl w:ilvl="3">
+      <w:start w:val="1"/>
+      <w:numFmt w:val="decimal"/>
+      <w:lvlText w:val="%1.%2.%3.%4."/>
+      <w:lvlJc w:val="left"/>
+      <w:pPr>
+        <w:ind w:left="1728" w:hanging="648"/>
+      </w:pPr>
+      <w:rPr>
+        <w:rFonts w:hint="default"/>
+      </w:rPr>
+    </w:lvl>
+    <w:lvl w:ilvl="4">
+      <w:start w:val="1"/>
+      <w:numFmt w:val="decimal"/>
+      <w:lvlText w:val="%1.%2.%3.%4.%5."/>
+      <w:lvlJc w:val="left"/>
+      <w:pPr>
+        <w:ind w:left="2232" w:hanging="792"/>
+      </w:pPr>
+      <w:rPr>
+        <w:rFonts w:hint="default"/>
+      </w:rPr>
+    </w:lvl>
+    <w:lvl w:ilvl="5">
+      <w:start w:val="1"/>
+      <w:numFmt w:val="decimal"/>
+      <w:lvlText w:val="%1.%2.%3.%4.%5.%6."/>
+      <w:lvlJc w:val="left"/>
+      <w:pPr>
+        <w:ind w:left="2736" w:hanging="936"/>
+      </w:pPr>
+      <w:rPr>
+        <w:rFonts w:hint="default"/>
+      </w:rPr>
+    </w:lvl>
+    <w:lvl w:ilvl="6">
+      <w:start w:val="1"/>
+      <w:numFmt w:val="decimal"/>
+      <w:lvlText w:val="%1.%2.%3.%4.%5.%6.%7."/>
+      <w:lvlJc w:val="left"/>
+      <w:pPr>
+        <w:ind w:left="3240" w:hanging="1080"/>
+      </w:pPr>
+      <w:rPr>
+        <w:rFonts w:hint="default"/>
+      </w:rPr>
+    </w:lvl>
+    <w:lvl w:ilvl="7">
+      <w:start w:val="1"/>
+      <w:numFmt w:val="decimal"/>
+      <w:lvlText w:val="%1.%2.%3.%4.%5.%6.%7.%8."/>
+      <w:lvlJc w:val="left"/>
+      <w:pPr>
+        <w:ind w:left="3744" w:hanging="1224"/>
+      </w:pPr>
+      <w:rPr>
+        <w:rFonts w:hint="default"/>
+      </w:rPr>
+    </w:lvl>
+    <w:lvl w:ilvl="8">
+      <w:start w:val="1"/>
+      <w:numFmt w:val="decimal"/>
+      <w:lvlText w:val="%1.%2.%3.%4.%5.%6.%7.%8.%9."/>
+      <w:lvlJc w:val="left"/>
+      <w:pPr>
+        <w:ind w:left="4320" w:hanging="1440"/>
+      </w:pPr>
+      <w:rPr>
+        <w:rFonts w:hint="default"/>
+      </w:rPr>
+    </w:lvl>
+  </w:abstractNum>
+  <w:abstractNum w:abstractNumId="1" w15:restartNumberingAfterBreak="0">
+    <w:nsid w:val="7B6C34D6"/>
+    <w:multiLevelType w:val="multilevel"/>
+    <w:tmpl w:val="643CAA50"/>
+    <w:lvl w:ilvl="0">
+      <w:start w:val="1"/>
+      <w:numFmt w:val="decimal"/>
+      <w:pStyle w:val="SzekdolgozatH1"/>
+      <w:lvlText w:val="%1."/>
+      <w:lvlJc w:val="left"/>
+      <w:pPr>
+        <w:ind w:left="357" w:hanging="357"/>
+      </w:pPr>
+      <w:rPr>
+        <w:rFonts w:hint="default"/>
+      </w:rPr>
+    </w:lvl>
+    <w:lvl w:ilvl="1">
+      <w:start w:val="1"/>
+      <w:numFmt w:val="decimal"/>
+      <w:pStyle w:val="Szakdolgozath2"/>
+      <w:lvlText w:val="%1.%2."/>
+      <w:lvlJc w:val="left"/>
+      <w:pPr>
+        <w:ind w:left="357" w:hanging="357"/>
+      </w:pPr>
+      <w:rPr>
+        <w:rFonts w:hint="default"/>
+      </w:rPr>
+    </w:lvl>
+    <w:lvl w:ilvl="2">
+      <w:start w:val="1"/>
+      <w:numFmt w:val="decimal"/>
+      <w:pStyle w:val="Szakdolgozath3"/>
+      <w:lvlText w:val="%1.%2.%3"/>
+      <w:lvlJc w:val="left"/>
+      <w:pPr>
+        <w:ind w:left="357" w:hanging="357"/>
+      </w:pPr>
+      <w:rPr>
+        <w:rFonts w:hint="default"/>
+      </w:rPr>
+    </w:lvl>
+    <w:lvl w:ilvl="3">
+      <w:start w:val="1"/>
+      <w:numFmt w:val="decimal"/>
+      <w:lvlText w:val="%1.%2.%3.%4."/>
+      <w:lvlJc w:val="left"/>
+      <w:pPr>
+        <w:ind w:left="1428" w:hanging="357"/>
+      </w:pPr>
+      <w:rPr>
+        <w:rFonts w:hint="default"/>
+      </w:rPr>
+    </w:lvl>
+    <w:lvl w:ilvl="4">
+      <w:start w:val="1"/>
+      <w:numFmt w:val="decimal"/>
+      <w:lvlText w:val="%1.%2.%3.%4.%5."/>
+      <w:lvlJc w:val="left"/>
+      <w:pPr>
+        <w:ind w:left="1785" w:hanging="357"/>
+      </w:pPr>
+      <w:rPr>
+        <w:rFonts w:hint="default"/>
+      </w:rPr>
+    </w:lvl>
+    <w:lvl w:ilvl="5">
+      <w:start w:val="1"/>
+      <w:numFmt w:val="decimal"/>
+      <w:lvlText w:val="%1.%2.%3.%4.%5.%6."/>
+      <w:lvlJc w:val="left"/>
+      <w:pPr>
+        <w:ind w:left="2142" w:hanging="357"/>
+      </w:pPr>
+      <w:rPr>
+        <w:rFonts w:hint="default"/>
+      </w:rPr>
+    </w:lvl>
+    <w:lvl w:ilvl="6">
+      <w:start w:val="1"/>
+      <w:numFmt w:val="decimal"/>
+      <w:lvlText w:val="%1.%2.%3.%4.%5.%6.%7."/>
+      <w:lvlJc w:val="left"/>
+      <w:pPr>
+        <w:ind w:left="2499" w:hanging="357"/>
+      </w:pPr>
+      <w:rPr>
+        <w:rFonts w:hint="default"/>
+      </w:rPr>
+    </w:lvl>
+    <w:lvl w:ilvl="7">
+      <w:start w:val="1"/>
+      <w:numFmt w:val="decimal"/>
+      <w:lvlText w:val="%1.%2.%3.%4.%5.%6.%7.%8."/>
+      <w:lvlJc w:val="left"/>
+      <w:pPr>
+        <w:ind w:left="2856" w:hanging="357"/>
+      </w:pPr>
+      <w:rPr>
+        <w:rFonts w:hint="default"/>
+      </w:rPr>
+    </w:lvl>
+    <w:lvl w:ilvl="8">
+      <w:start w:val="1"/>
+      <w:numFmt w:val="decimal"/>
+      <w:lvlText w:val="%1.%2.%3.%4.%5.%6.%7.%8.%9."/>
+      <w:lvlJc w:val="left"/>
+      <w:pPr>
+        <w:ind w:left="3213" w:hanging="357"/>
+      </w:pPr>
+      <w:rPr>
+        <w:rFonts w:hint="default"/>
+      </w:rPr>
+    </w:lvl>
+  </w:abstractNum>
+  <w:num w:numId="1" w16cid:durableId="1477646002">
+    <w:abstractNumId w:val="0"/>
+  </w:num>
+  <w:num w:numId="2" w16cid:durableId="794058620">
+    <w:abstractNumId w:val="0"/>
+  </w:num>
+  <w:num w:numId="3" w16cid:durableId="625625629">
+    <w:abstractNumId w:val="1"/>
+  </w:num>
+</w:numbering>
 </file>
 
 <file path=word/styles.xml><?xml version="1.0" encoding="utf-8"?>
@@ -1112,7 +4160,7 @@
   <w:style w:type="paragraph" w:default="1" w:styleId="Normal">
     <w:name w:val="Normal"/>
     <w:qFormat/>
-    <w:rsid w:val="001C0538"/>
+    <w:rsid w:val="006051AC"/>
     <w:rPr>
       <w:lang w:val="hu-HU"/>
     </w:rPr>
@@ -1874,6 +4922,167 @@
       <w:lang w:eastAsia="hu-HU"/>
       <w14:ligatures w14:val="none"/>
     </w:rPr>
+  </w:style>
+  <w:style w:type="paragraph" w:styleId="TOCHeading">
+    <w:name w:val="TOC Heading"/>
+    <w:basedOn w:val="Heading1"/>
+    <w:next w:val="Normal"/>
+    <w:uiPriority w:val="39"/>
+    <w:unhideWhenUsed/>
+    <w:qFormat/>
+    <w:rsid w:val="00BC333B"/>
+    <w:pPr>
+      <w:spacing w:before="240" w:after="0" w:line="259" w:lineRule="auto"/>
+      <w:outlineLvl w:val="9"/>
+    </w:pPr>
+    <w:rPr>
+      <w:kern w:val="0"/>
+      <w:sz w:val="32"/>
+      <w:szCs w:val="32"/>
+      <w:lang w:val="en-US"/>
+      <w14:ligatures w14:val="none"/>
+    </w:rPr>
+  </w:style>
+  <w:style w:type="paragraph" w:customStyle="1" w:styleId="SzekdolgozatH1">
+    <w:name w:val="Szekdolgozat H1"/>
+    <w:basedOn w:val="Heading1"/>
+    <w:qFormat/>
+    <w:rsid w:val="006051AC"/>
+    <w:pPr>
+      <w:numPr>
+        <w:numId w:val="3"/>
+      </w:numPr>
+      <w:spacing w:before="280" w:after="280"/>
+    </w:pPr>
+    <w:rPr>
+      <w:rFonts w:ascii="Times New Roman" w:hAnsi="Times New Roman" w:cs="Arial"/>
+      <w:b/>
+      <w:bCs/>
+      <w:iCs/>
+      <w:color w:val="000000" w:themeColor="text1"/>
+      <w:sz w:val="28"/>
+      <w:szCs w:val="28"/>
+    </w:rPr>
+  </w:style>
+  <w:style w:type="paragraph" w:customStyle="1" w:styleId="Szakdolgozatbekezds">
+    <w:name w:val="Szakdolgozat bekezdés"/>
+    <w:basedOn w:val="Normal"/>
+    <w:qFormat/>
+    <w:rsid w:val="00DB774B"/>
+    <w:pPr>
+      <w:spacing w:line="360" w:lineRule="auto"/>
+      <w:jc w:val="both"/>
+    </w:pPr>
+    <w:rPr>
+      <w:rFonts w:ascii="Times New Roman" w:hAnsi="Times New Roman" w:cs="Times New Roman"/>
+      <w:sz w:val="24"/>
+      <w:szCs w:val="24"/>
+    </w:rPr>
+  </w:style>
+  <w:style w:type="paragraph" w:customStyle="1" w:styleId="Szakdolgozath2">
+    <w:name w:val="Szakdolgozat h2"/>
+    <w:basedOn w:val="Heading2"/>
+    <w:qFormat/>
+    <w:rsid w:val="00F975A5"/>
+    <w:pPr>
+      <w:numPr>
+        <w:ilvl w:val="1"/>
+        <w:numId w:val="3"/>
+      </w:numPr>
+      <w:spacing w:before="280" w:after="200"/>
+    </w:pPr>
+    <w:rPr>
+      <w:rFonts w:ascii="Times New Roman" w:hAnsi="Times New Roman"/>
+      <w:b/>
+      <w:color w:val="000000" w:themeColor="text1"/>
+      <w:sz w:val="24"/>
+    </w:rPr>
+  </w:style>
+  <w:style w:type="paragraph" w:styleId="TOC1">
+    <w:name w:val="toc 1"/>
+    <w:basedOn w:val="Normal"/>
+    <w:next w:val="Normal"/>
+    <w:autoRedefine/>
+    <w:uiPriority w:val="39"/>
+    <w:unhideWhenUsed/>
+    <w:rsid w:val="00F975A5"/>
+    <w:pPr>
+      <w:spacing w:after="100"/>
+    </w:pPr>
+  </w:style>
+  <w:style w:type="paragraph" w:styleId="TOC2">
+    <w:name w:val="toc 2"/>
+    <w:basedOn w:val="Normal"/>
+    <w:next w:val="Normal"/>
+    <w:autoRedefine/>
+    <w:uiPriority w:val="39"/>
+    <w:unhideWhenUsed/>
+    <w:rsid w:val="00F975A5"/>
+    <w:pPr>
+      <w:spacing w:after="100"/>
+      <w:ind w:left="220"/>
+    </w:pPr>
+  </w:style>
+  <w:style w:type="character" w:styleId="Hyperlink">
+    <w:name w:val="Hyperlink"/>
+    <w:basedOn w:val="DefaultParagraphFont"/>
+    <w:uiPriority w:val="99"/>
+    <w:unhideWhenUsed/>
+    <w:rsid w:val="00F975A5"/>
+    <w:rPr>
+      <w:color w:val="0563C1" w:themeColor="hyperlink"/>
+      <w:u w:val="single"/>
+    </w:rPr>
+  </w:style>
+  <w:style w:type="paragraph" w:styleId="TOC3">
+    <w:name w:val="toc 3"/>
+    <w:basedOn w:val="Normal"/>
+    <w:next w:val="Normal"/>
+    <w:autoRedefine/>
+    <w:uiPriority w:val="39"/>
+    <w:unhideWhenUsed/>
+    <w:rsid w:val="00F975A5"/>
+    <w:pPr>
+      <w:spacing w:after="100" w:line="259" w:lineRule="auto"/>
+      <w:ind w:left="440"/>
+    </w:pPr>
+    <w:rPr>
+      <w:rFonts w:eastAsiaTheme="minorEastAsia" w:cs="Times New Roman"/>
+      <w:kern w:val="0"/>
+      <w:lang w:val="en-US"/>
+      <w14:ligatures w14:val="none"/>
+    </w:rPr>
+  </w:style>
+  <w:style w:type="paragraph" w:customStyle="1" w:styleId="Szakdolgozath3">
+    <w:name w:val="Szakdolgozat h3"/>
+    <w:basedOn w:val="Normal"/>
+    <w:next w:val="Normal"/>
+    <w:qFormat/>
+    <w:rsid w:val="009D25A5"/>
+    <w:pPr>
+      <w:numPr>
+        <w:ilvl w:val="2"/>
+        <w:numId w:val="3"/>
+      </w:numPr>
+      <w:spacing w:before="280" w:after="200"/>
+    </w:pPr>
+    <w:rPr>
+      <w:rFonts w:ascii="Times New Roman" w:hAnsi="Times New Roman"/>
+      <w:b/>
+      <w:sz w:val="24"/>
+    </w:rPr>
+  </w:style>
+  <w:style w:type="paragraph" w:customStyle="1" w:styleId="szmozatlanSzakdolgozath1">
+    <w:name w:val="(számozatlan) Szakdolgozat h1"/>
+    <w:basedOn w:val="SzekdolgozatH1"/>
+    <w:qFormat/>
+    <w:rsid w:val="006051AC"/>
+    <w:pPr>
+      <w:numPr>
+        <w:numId w:val="0"/>
+      </w:numPr>
+      <w:jc w:val="center"/>
+    </w:pPr>
   </w:style>
 </w:styles>
 </file>

</xml_diff>